<commit_message>
Added Quartile NAV figures for FUNDS, Added the percentage of the Fund represnted by the Holdings Listed.
</commit_message>
<xml_diff>
--- a/Week 4/Asset and Wealth Management project/Docs/Asset and Wealth Management Application overview.docx
+++ b/Week 4/Asset and Wealth Management project/Docs/Asset and Wealth Management Application overview.docx
@@ -1072,14 +1072,35 @@
           <w:szCs w:val="32"/>
         </w:rPr>
         <w:lastRenderedPageBreak/>
-        <w:t xml:space="preserve">Mandate: The mandate table will hold information on customer </w:t>
-      </w:r>
-      <w:r>
-        <w:rPr>
-          <w:sz w:val="32"/>
-          <w:szCs w:val="32"/>
-        </w:rPr>
-        <w:t xml:space="preserve">mandates such as client name, excluded sectors, </w:t>
+        <w:t>Clients</w:t>
+      </w:r>
+      <w:r>
+        <w:rPr>
+          <w:sz w:val="32"/>
+          <w:szCs w:val="32"/>
+        </w:rPr>
+        <w:t xml:space="preserve">: The </w:t>
+      </w:r>
+      <w:r>
+        <w:rPr>
+          <w:sz w:val="32"/>
+          <w:szCs w:val="32"/>
+        </w:rPr>
+        <w:t>client</w:t>
+      </w:r>
+      <w:r>
+        <w:rPr>
+          <w:sz w:val="32"/>
+          <w:szCs w:val="32"/>
+        </w:rPr>
+        <w:t xml:space="preserve"> table will hold information on customer </w:t>
+      </w:r>
+      <w:r>
+        <w:rPr>
+          <w:sz w:val="32"/>
+          <w:szCs w:val="32"/>
+        </w:rPr>
+        <w:t xml:space="preserve">mandates such as excluded sectors, </w:t>
       </w:r>
       <w:r>
         <w:rPr>
@@ -1782,20 +1803,30 @@
         </w:rPr>
         <w:t>d</w:t>
       </w:r>
-    </w:p>
-    <w:p>
-      <w:pPr>
-        <w:ind w:left="1080"/>
-        <w:rPr>
-          <w:b/>
-          <w:bCs/>
-          <w:sz w:val="48"/>
-          <w:szCs w:val="48"/>
-        </w:rPr>
-      </w:pPr>
-      <w:r>
+      <w:r>
+        <w:rPr>
+          <w:sz w:val="32"/>
+          <w:szCs w:val="32"/>
+        </w:rPr>
+        <w:t>:</w:t>
+      </w:r>
+    </w:p>
+    <w:p>
+      <w:pPr>
+        <w:pStyle w:val="ListParagraph"/>
+        <w:rPr>
+          <w:b/>
+          <w:bCs/>
+          <w:sz w:val="40"/>
+          <w:szCs w:val="40"/>
+        </w:rPr>
+      </w:pPr>
+      <w:r>
+        <w:rPr>
+          <w:noProof/>
+        </w:rPr>
         <w:drawing>
-          <wp:inline distT="0" distB="0" distL="0" distR="0" wp14:anchorId="675726DB" wp14:editId="7BEADC98">
+          <wp:inline distT="0" distB="0" distL="0" distR="0" wp14:anchorId="76889F1E" wp14:editId="724D3DC1">
             <wp:extent cx="5271323" cy="2767649"/>
             <wp:effectExtent l="0" t="0" r="5715" b="0"/>
             <wp:docPr id="930340344" name="Picture 1"/>
@@ -1810,7 +1841,7 @@
                     <pic:cNvPicPr/>
                   </pic:nvPicPr>
                   <pic:blipFill>
-                    <a:blip r:embed="rId5"/>
+                    <a:blip r:embed="rId6"/>
                     <a:stretch>
                       <a:fillRect/>
                     </a:stretch>
@@ -1833,6 +1864,87 @@
     </w:p>
     <w:p>
       <w:pPr>
+        <w:pStyle w:val="ListParagraph"/>
+        <w:numPr>
+          <w:ilvl w:val="1"/>
+          <w:numId w:val="1"/>
+        </w:numPr>
+        <w:rPr>
+          <w:sz w:val="40"/>
+          <w:szCs w:val="40"/>
+        </w:rPr>
+      </w:pPr>
+      <w:r>
+        <w:rPr>
+          <w:sz w:val="32"/>
+          <w:szCs w:val="32"/>
+        </w:rPr>
+        <w:lastRenderedPageBreak/>
+        <w:t>Ongoing Charge Percentage:</w:t>
+      </w:r>
+      <w:r>
+        <w:rPr>
+          <w:sz w:val="32"/>
+          <w:szCs w:val="32"/>
+        </w:rPr>
+        <w:t xml:space="preserve"> </w:t>
+      </w:r>
+      <w:r>
+        <w:rPr>
+          <w:sz w:val="32"/>
+          <w:szCs w:val="32"/>
+        </w:rPr>
+        <w:t>The ongoing charge percentage is the annual fee charged by a fund to cover the ongoing costs of managing and operating the fund.</w:t>
+      </w:r>
+    </w:p>
+    <w:p>
+      <w:pPr>
+        <w:rPr>
+          <w:sz w:val="40"/>
+          <w:szCs w:val="40"/>
+        </w:rPr>
+      </w:pPr>
+    </w:p>
+    <w:p>
+      <w:pPr>
+        <w:pStyle w:val="ListParagraph"/>
+        <w:numPr>
+          <w:ilvl w:val="1"/>
+          <w:numId w:val="1"/>
+        </w:numPr>
+        <w:rPr>
+          <w:sz w:val="40"/>
+          <w:szCs w:val="40"/>
+        </w:rPr>
+      </w:pPr>
+      <w:r>
+        <w:rPr>
+          <w:sz w:val="32"/>
+          <w:szCs w:val="32"/>
+        </w:rPr>
+        <w:t>Net Asset Value:</w:t>
+      </w:r>
+      <w:r>
+        <w:rPr>
+          <w:sz w:val="32"/>
+          <w:szCs w:val="32"/>
+        </w:rPr>
+        <w:t xml:space="preserve"> NAV is the total value of an investment fund's or company's assets minus its liabilities. It tells you the net worth of the entity, or the per-share value of an investment like a mutual fund, exchange-traded fund (ETF), or unit investment trust.</w:t>
+      </w:r>
+    </w:p>
+    <w:p>
+      <w:pPr>
+        <w:ind w:left="1080"/>
+        <w:rPr>
+          <w:b/>
+          <w:bCs/>
+          <w:sz w:val="48"/>
+          <w:szCs w:val="48"/>
+        </w:rPr>
+      </w:pPr>
+    </w:p>
+    <w:p>
+      <w:pPr>
         <w:ind w:left="1080"/>
         <w:rPr>
           <w:b/>
@@ -1892,7 +2004,7 @@
   <w:abstractNum w:abstractNumId="0" w15:restartNumberingAfterBreak="0">
     <w:nsid w:val="2C242B6D"/>
     <w:multiLevelType w:val="hybridMultilevel"/>
-    <w:tmpl w:val="92EC0154"/>
+    <w:tmpl w:val="62B2DCDA"/>
     <w:lvl w:ilvl="0" w:tplc="0809000F">
       <w:start w:val="1"/>
       <w:numFmt w:val="decimal"/>
@@ -1902,7 +2014,7 @@
         <w:ind w:left="720" w:hanging="360"/>
       </w:pPr>
     </w:lvl>
-    <w:lvl w:ilvl="1" w:tplc="08090019">
+    <w:lvl w:ilvl="1" w:tplc="1B48230A">
       <w:start w:val="1"/>
       <w:numFmt w:val="lowerLetter"/>
       <w:lvlText w:val="%2."/>
@@ -1910,6 +2022,10 @@
       <w:pPr>
         <w:ind w:left="1440" w:hanging="360"/>
       </w:pPr>
+      <w:rPr>
+        <w:b/>
+        <w:bCs/>
+      </w:rPr>
     </w:lvl>
     <w:lvl w:ilvl="2" w:tplc="BEC28950">
       <w:start w:val="1"/>
@@ -3217,4 +3333,16 @@
     </a:ext>
   </a:extLst>
 </a:theme>
+</file>
+
+<file path=customXml/item1.xml><?xml version="1.0" encoding="utf-8"?>
+<b:Sources xmlns:b="http://schemas.openxmlformats.org/officeDocument/2006/bibliography" xmlns="http://schemas.openxmlformats.org/officeDocument/2006/bibliography" SelectedStyle="\APASixthEditionOfficeOnline.xsl" StyleName="APA" Version="6"/>
+</file>
+
+<file path=customXml/itemProps1.xml><?xml version="1.0" encoding="utf-8"?>
+<ds:datastoreItem xmlns:ds="http://schemas.openxmlformats.org/officeDocument/2006/customXml" ds:itemID="{2927A164-6561-4D66-B53E-51DB320B13EC}">
+  <ds:schemaRefs>
+    <ds:schemaRef ds:uri="http://schemas.openxmlformats.org/officeDocument/2006/bibliography"/>
+  </ds:schemaRefs>
+</ds:datastoreItem>
 </file>
</xml_diff>

<commit_message>
Added 3 endpooints to clients.py. GET all clients GET specific client POST new or UPDATE existing client
</commit_message>
<xml_diff>
--- a/Week 4/Asset and Wealth Management project/Docs/Asset and Wealth Management Application overview.docx
+++ b/Week 4/Asset and Wealth Management project/Docs/Asset and Wealth Management Application overview.docx
@@ -34,6 +34,618 @@
         <w:t>and Wealth Management Application</w:t>
       </w:r>
     </w:p>
+    <w:sdt>
+      <w:sdtPr>
+        <w:id w:val="-1748097944"/>
+        <w:docPartObj>
+          <w:docPartGallery w:val="Table of Contents"/>
+          <w:docPartUnique/>
+        </w:docPartObj>
+      </w:sdtPr>
+      <w:sdtEndPr>
+        <w:rPr>
+          <w:rFonts w:asciiTheme="minorHAnsi" w:eastAsiaTheme="minorHAnsi" w:hAnsiTheme="minorHAnsi" w:cstheme="minorBidi"/>
+          <w:b/>
+          <w:bCs/>
+          <w:noProof/>
+          <w:color w:val="auto"/>
+          <w:kern w:val="2"/>
+          <w:sz w:val="24"/>
+          <w:szCs w:val="24"/>
+          <w:lang w:val="en-GB"/>
+          <w14:ligatures w14:val="standardContextual"/>
+        </w:rPr>
+      </w:sdtEndPr>
+      <w:sdtContent>
+        <w:p>
+          <w:pPr>
+            <w:pStyle w:val="TOCHeading"/>
+          </w:pPr>
+          <w:r>
+            <w:t>Contents</w:t>
+          </w:r>
+        </w:p>
+        <w:p>
+          <w:pPr>
+            <w:pStyle w:val="TOC1"/>
+            <w:tabs>
+              <w:tab w:val="right" w:leader="dot" w:pos="9016"/>
+            </w:tabs>
+            <w:rPr>
+              <w:rFonts w:eastAsiaTheme="minorEastAsia"/>
+              <w:noProof/>
+              <w:lang w:eastAsia="en-GB"/>
+            </w:rPr>
+          </w:pPr>
+          <w:r>
+            <w:fldChar w:fldCharType="begin"/>
+          </w:r>
+          <w:r>
+            <w:instrText xml:space="preserve"> TOC \o "1-3" \h \z \u </w:instrText>
+          </w:r>
+          <w:r>
+            <w:fldChar w:fldCharType="separate"/>
+          </w:r>
+          <w:hyperlink w:anchor="_Toc241779753" w:history="1">
+            <w:r>
+              <w:rPr>
+                <w:rStyle w:val="Hyperlink"/>
+                <w:noProof/>
+              </w:rPr>
+              <w:t>The problem</w:t>
+            </w:r>
+            <w:r>
+              <w:rPr>
+                <w:noProof/>
+                <w:webHidden/>
+              </w:rPr>
+              <w:tab/>
+            </w:r>
+            <w:r>
+              <w:rPr>
+                <w:noProof/>
+                <w:webHidden/>
+              </w:rPr>
+              <w:fldChar w:fldCharType="begin"/>
+            </w:r>
+            <w:r>
+              <w:rPr>
+                <w:noProof/>
+                <w:webHidden/>
+              </w:rPr>
+              <w:instrText xml:space="preserve"> PAGEREF _Toc241779753 \h </w:instrText>
+            </w:r>
+            <w:r>
+              <w:rPr>
+                <w:noProof/>
+                <w:webHidden/>
+              </w:rPr>
+            </w:r>
+            <w:r>
+              <w:rPr>
+                <w:noProof/>
+                <w:webHidden/>
+              </w:rPr>
+              <w:fldChar w:fldCharType="separate"/>
+            </w:r>
+            <w:r>
+              <w:rPr>
+                <w:noProof/>
+                <w:webHidden/>
+              </w:rPr>
+              <w:t>1</w:t>
+            </w:r>
+            <w:r>
+              <w:rPr>
+                <w:noProof/>
+                <w:webHidden/>
+              </w:rPr>
+              <w:fldChar w:fldCharType="end"/>
+            </w:r>
+          </w:hyperlink>
+        </w:p>
+        <w:p>
+          <w:pPr>
+            <w:pStyle w:val="TOC1"/>
+            <w:tabs>
+              <w:tab w:val="right" w:leader="dot" w:pos="9016"/>
+            </w:tabs>
+            <w:rPr>
+              <w:rFonts w:eastAsiaTheme="minorEastAsia"/>
+              <w:noProof/>
+              <w:lang w:eastAsia="en-GB"/>
+            </w:rPr>
+          </w:pPr>
+          <w:hyperlink w:anchor="_Toc241779754" w:history="1">
+            <w:r>
+              <w:rPr>
+                <w:rStyle w:val="Hyperlink"/>
+                <w:noProof/>
+              </w:rPr>
+              <w:t>What is being built</w:t>
+            </w:r>
+            <w:r>
+              <w:rPr>
+                <w:noProof/>
+                <w:webHidden/>
+              </w:rPr>
+              <w:tab/>
+            </w:r>
+            <w:r>
+              <w:rPr>
+                <w:noProof/>
+                <w:webHidden/>
+              </w:rPr>
+              <w:fldChar w:fldCharType="begin"/>
+            </w:r>
+            <w:r>
+              <w:rPr>
+                <w:noProof/>
+                <w:webHidden/>
+              </w:rPr>
+              <w:instrText xml:space="preserve"> PAGEREF _Toc241779754 \h </w:instrText>
+            </w:r>
+            <w:r>
+              <w:rPr>
+                <w:noProof/>
+                <w:webHidden/>
+              </w:rPr>
+            </w:r>
+            <w:r>
+              <w:rPr>
+                <w:noProof/>
+                <w:webHidden/>
+              </w:rPr>
+              <w:fldChar w:fldCharType="separate"/>
+            </w:r>
+            <w:r>
+              <w:rPr>
+                <w:noProof/>
+                <w:webHidden/>
+              </w:rPr>
+              <w:t>1</w:t>
+            </w:r>
+            <w:r>
+              <w:rPr>
+                <w:noProof/>
+                <w:webHidden/>
+              </w:rPr>
+              <w:fldChar w:fldCharType="end"/>
+            </w:r>
+          </w:hyperlink>
+        </w:p>
+        <w:p>
+          <w:pPr>
+            <w:pStyle w:val="TOC1"/>
+            <w:tabs>
+              <w:tab w:val="right" w:leader="dot" w:pos="9016"/>
+            </w:tabs>
+            <w:rPr>
+              <w:rFonts w:eastAsiaTheme="minorEastAsia"/>
+              <w:noProof/>
+              <w:lang w:eastAsia="en-GB"/>
+            </w:rPr>
+          </w:pPr>
+          <w:hyperlink w:anchor="_Toc241779755" w:history="1">
+            <w:r>
+              <w:rPr>
+                <w:rStyle w:val="Hyperlink"/>
+                <w:noProof/>
+              </w:rPr>
+              <w:t>Implementation</w:t>
+            </w:r>
+            <w:r>
+              <w:rPr>
+                <w:noProof/>
+                <w:webHidden/>
+              </w:rPr>
+              <w:tab/>
+            </w:r>
+            <w:r>
+              <w:rPr>
+                <w:noProof/>
+                <w:webHidden/>
+              </w:rPr>
+              <w:fldChar w:fldCharType="begin"/>
+            </w:r>
+            <w:r>
+              <w:rPr>
+                <w:noProof/>
+                <w:webHidden/>
+              </w:rPr>
+              <w:instrText xml:space="preserve"> PAGEREF _Toc241779755 \h </w:instrText>
+            </w:r>
+            <w:r>
+              <w:rPr>
+                <w:noProof/>
+                <w:webHidden/>
+              </w:rPr>
+            </w:r>
+            <w:r>
+              <w:rPr>
+                <w:noProof/>
+                <w:webHidden/>
+              </w:rPr>
+              <w:fldChar w:fldCharType="separate"/>
+            </w:r>
+            <w:r>
+              <w:rPr>
+                <w:noProof/>
+                <w:webHidden/>
+              </w:rPr>
+              <w:t>2</w:t>
+            </w:r>
+            <w:r>
+              <w:rPr>
+                <w:noProof/>
+                <w:webHidden/>
+              </w:rPr>
+              <w:fldChar w:fldCharType="end"/>
+            </w:r>
+          </w:hyperlink>
+        </w:p>
+        <w:p>
+          <w:pPr>
+            <w:pStyle w:val="TOC2"/>
+            <w:tabs>
+              <w:tab w:val="right" w:leader="dot" w:pos="9016"/>
+            </w:tabs>
+            <w:rPr>
+              <w:rFonts w:eastAsiaTheme="minorEastAsia"/>
+              <w:noProof/>
+              <w:lang w:eastAsia="en-GB"/>
+            </w:rPr>
+          </w:pPr>
+          <w:hyperlink w:anchor="_Toc241779756" w:history="1">
+            <w:r>
+              <w:rPr>
+                <w:rStyle w:val="Hyperlink"/>
+                <w:noProof/>
+              </w:rPr>
+              <w:t>Architecture:</w:t>
+            </w:r>
+            <w:r>
+              <w:rPr>
+                <w:noProof/>
+                <w:webHidden/>
+              </w:rPr>
+              <w:tab/>
+            </w:r>
+            <w:r>
+              <w:rPr>
+                <w:noProof/>
+                <w:webHidden/>
+              </w:rPr>
+              <w:fldChar w:fldCharType="begin"/>
+            </w:r>
+            <w:r>
+              <w:rPr>
+                <w:noProof/>
+                <w:webHidden/>
+              </w:rPr>
+              <w:instrText xml:space="preserve"> PAGEREF _Toc241779756 \h </w:instrText>
+            </w:r>
+            <w:r>
+              <w:rPr>
+                <w:noProof/>
+                <w:webHidden/>
+              </w:rPr>
+            </w:r>
+            <w:r>
+              <w:rPr>
+                <w:noProof/>
+                <w:webHidden/>
+              </w:rPr>
+              <w:fldChar w:fldCharType="separate"/>
+            </w:r>
+            <w:r>
+              <w:rPr>
+                <w:noProof/>
+                <w:webHidden/>
+              </w:rPr>
+              <w:t>2</w:t>
+            </w:r>
+            <w:r>
+              <w:rPr>
+                <w:noProof/>
+                <w:webHidden/>
+              </w:rPr>
+              <w:fldChar w:fldCharType="end"/>
+            </w:r>
+          </w:hyperlink>
+        </w:p>
+        <w:p>
+          <w:pPr>
+            <w:pStyle w:val="TOC2"/>
+            <w:tabs>
+              <w:tab w:val="right" w:leader="dot" w:pos="9016"/>
+            </w:tabs>
+            <w:rPr>
+              <w:rFonts w:eastAsiaTheme="minorEastAsia"/>
+              <w:noProof/>
+              <w:lang w:eastAsia="en-GB"/>
+            </w:rPr>
+          </w:pPr>
+          <w:hyperlink w:anchor="_Toc241779757" w:history="1">
+            <w:r>
+              <w:rPr>
+                <w:rStyle w:val="Hyperlink"/>
+                <w:noProof/>
+              </w:rPr>
+              <w:t>Design tools:</w:t>
+            </w:r>
+            <w:r>
+              <w:rPr>
+                <w:noProof/>
+                <w:webHidden/>
+              </w:rPr>
+              <w:tab/>
+            </w:r>
+            <w:r>
+              <w:rPr>
+                <w:noProof/>
+                <w:webHidden/>
+              </w:rPr>
+              <w:fldChar w:fldCharType="begin"/>
+            </w:r>
+            <w:r>
+              <w:rPr>
+                <w:noProof/>
+                <w:webHidden/>
+              </w:rPr>
+              <w:instrText xml:space="preserve"> PAGEREF _Toc241779757 \h </w:instrText>
+            </w:r>
+            <w:r>
+              <w:rPr>
+                <w:noProof/>
+                <w:webHidden/>
+              </w:rPr>
+            </w:r>
+            <w:r>
+              <w:rPr>
+                <w:noProof/>
+                <w:webHidden/>
+              </w:rPr>
+              <w:fldChar w:fldCharType="separate"/>
+            </w:r>
+            <w:r>
+              <w:rPr>
+                <w:noProof/>
+                <w:webHidden/>
+              </w:rPr>
+              <w:t>2</w:t>
+            </w:r>
+            <w:r>
+              <w:rPr>
+                <w:noProof/>
+                <w:webHidden/>
+              </w:rPr>
+              <w:fldChar w:fldCharType="end"/>
+            </w:r>
+          </w:hyperlink>
+        </w:p>
+        <w:p>
+          <w:pPr>
+            <w:pStyle w:val="TOC2"/>
+            <w:tabs>
+              <w:tab w:val="right" w:leader="dot" w:pos="9016"/>
+            </w:tabs>
+            <w:rPr>
+              <w:rFonts w:eastAsiaTheme="minorEastAsia"/>
+              <w:noProof/>
+              <w:lang w:eastAsia="en-GB"/>
+            </w:rPr>
+          </w:pPr>
+          <w:hyperlink w:anchor="_Toc241779758" w:history="1">
+            <w:r>
+              <w:rPr>
+                <w:rStyle w:val="Hyperlink"/>
+                <w:noProof/>
+              </w:rPr>
+              <w:t>Data:</w:t>
+            </w:r>
+            <w:r>
+              <w:rPr>
+                <w:noProof/>
+                <w:webHidden/>
+              </w:rPr>
+              <w:tab/>
+            </w:r>
+            <w:r>
+              <w:rPr>
+                <w:noProof/>
+                <w:webHidden/>
+              </w:rPr>
+              <w:fldChar w:fldCharType="begin"/>
+            </w:r>
+            <w:r>
+              <w:rPr>
+                <w:noProof/>
+                <w:webHidden/>
+              </w:rPr>
+              <w:instrText xml:space="preserve"> PAGEREF _Toc241779758 \h </w:instrText>
+            </w:r>
+            <w:r>
+              <w:rPr>
+                <w:noProof/>
+                <w:webHidden/>
+              </w:rPr>
+            </w:r>
+            <w:r>
+              <w:rPr>
+                <w:noProof/>
+                <w:webHidden/>
+              </w:rPr>
+              <w:fldChar w:fldCharType="separate"/>
+            </w:r>
+            <w:r>
+              <w:rPr>
+                <w:noProof/>
+                <w:webHidden/>
+              </w:rPr>
+              <w:t>3</w:t>
+            </w:r>
+            <w:r>
+              <w:rPr>
+                <w:noProof/>
+                <w:webHidden/>
+              </w:rPr>
+              <w:fldChar w:fldCharType="end"/>
+            </w:r>
+          </w:hyperlink>
+        </w:p>
+        <w:p>
+          <w:pPr>
+            <w:pStyle w:val="TOC2"/>
+            <w:tabs>
+              <w:tab w:val="right" w:leader="dot" w:pos="9016"/>
+            </w:tabs>
+            <w:rPr>
+              <w:rFonts w:eastAsiaTheme="minorEastAsia"/>
+              <w:noProof/>
+              <w:lang w:eastAsia="en-GB"/>
+            </w:rPr>
+          </w:pPr>
+          <w:hyperlink w:anchor="_Toc241779759" w:history="1">
+            <w:r>
+              <w:rPr>
+                <w:rStyle w:val="Hyperlink"/>
+                <w:noProof/>
+              </w:rPr>
+              <w:t>Agent tools:</w:t>
+            </w:r>
+            <w:r>
+              <w:rPr>
+                <w:noProof/>
+                <w:webHidden/>
+              </w:rPr>
+              <w:tab/>
+            </w:r>
+            <w:r>
+              <w:rPr>
+                <w:noProof/>
+                <w:webHidden/>
+              </w:rPr>
+              <w:fldChar w:fldCharType="begin"/>
+            </w:r>
+            <w:r>
+              <w:rPr>
+                <w:noProof/>
+                <w:webHidden/>
+              </w:rPr>
+              <w:instrText xml:space="preserve"> PAGEREF _Toc241779759 \h </w:instrText>
+            </w:r>
+            <w:r>
+              <w:rPr>
+                <w:noProof/>
+                <w:webHidden/>
+              </w:rPr>
+            </w:r>
+            <w:r>
+              <w:rPr>
+                <w:noProof/>
+                <w:webHidden/>
+              </w:rPr>
+              <w:fldChar w:fldCharType="separate"/>
+            </w:r>
+            <w:r>
+              <w:rPr>
+                <w:noProof/>
+                <w:webHidden/>
+              </w:rPr>
+              <w:t>3</w:t>
+            </w:r>
+            <w:r>
+              <w:rPr>
+                <w:noProof/>
+                <w:webHidden/>
+              </w:rPr>
+              <w:fldChar w:fldCharType="end"/>
+            </w:r>
+          </w:hyperlink>
+        </w:p>
+        <w:p>
+          <w:pPr>
+            <w:pStyle w:val="TOC1"/>
+            <w:tabs>
+              <w:tab w:val="right" w:leader="dot" w:pos="9016"/>
+            </w:tabs>
+            <w:rPr>
+              <w:rFonts w:eastAsiaTheme="minorEastAsia"/>
+              <w:noProof/>
+              <w:lang w:eastAsia="en-GB"/>
+            </w:rPr>
+          </w:pPr>
+          <w:hyperlink w:anchor="_Toc241779760" w:history="1">
+            <w:r>
+              <w:rPr>
+                <w:rStyle w:val="Hyperlink"/>
+                <w:noProof/>
+              </w:rPr>
+              <w:t>Key Words:</w:t>
+            </w:r>
+            <w:r>
+              <w:rPr>
+                <w:noProof/>
+                <w:webHidden/>
+              </w:rPr>
+              <w:tab/>
+            </w:r>
+            <w:r>
+              <w:rPr>
+                <w:noProof/>
+                <w:webHidden/>
+              </w:rPr>
+              <w:fldChar w:fldCharType="begin"/>
+            </w:r>
+            <w:r>
+              <w:rPr>
+                <w:noProof/>
+                <w:webHidden/>
+              </w:rPr>
+              <w:instrText xml:space="preserve"> PAGEREF _Toc241779760 \h </w:instrText>
+            </w:r>
+            <w:r>
+              <w:rPr>
+                <w:noProof/>
+                <w:webHidden/>
+              </w:rPr>
+            </w:r>
+            <w:r>
+              <w:rPr>
+                <w:noProof/>
+                <w:webHidden/>
+              </w:rPr>
+              <w:fldChar w:fldCharType="separate"/>
+            </w:r>
+            <w:r>
+              <w:rPr>
+                <w:noProof/>
+                <w:webHidden/>
+              </w:rPr>
+              <w:t>4</w:t>
+            </w:r>
+            <w:r>
+              <w:rPr>
+                <w:noProof/>
+                <w:webHidden/>
+              </w:rPr>
+              <w:fldChar w:fldCharType="end"/>
+            </w:r>
+          </w:hyperlink>
+        </w:p>
+        <w:p>
+          <w:r>
+            <w:rPr>
+              <w:b/>
+              <w:bCs/>
+              <w:noProof/>
+            </w:rPr>
+            <w:fldChar w:fldCharType="end"/>
+          </w:r>
+        </w:p>
+      </w:sdtContent>
+    </w:sdt>
     <w:p>
       <w:pPr>
         <w:jc w:val="center"/>
@@ -48,28 +660,18 @@
     </w:p>
     <w:p>
       <w:pPr>
-        <w:pStyle w:val="ListParagraph"/>
-        <w:numPr>
-          <w:ilvl w:val="0"/>
-          <w:numId w:val="1"/>
-        </w:numPr>
-        <w:rPr>
-          <w:b/>
-          <w:bCs/>
+        <w:pStyle w:val="Heading1"/>
+        <w:rPr>
           <w:sz w:val="36"/>
           <w:szCs w:val="36"/>
           <w:u w:val="single"/>
         </w:rPr>
       </w:pPr>
-      <w:r>
-        <w:rPr>
-          <w:b/>
-          <w:bCs/>
-          <w:sz w:val="40"/>
-          <w:szCs w:val="40"/>
-        </w:rPr>
+      <w:bookmarkStart w:id="0" w:name="_Toc241779753"/>
+      <w:r>
         <w:t>The problem</w:t>
       </w:r>
+      <w:bookmarkEnd w:id="0"/>
     </w:p>
     <w:p>
       <w:pPr>
@@ -190,54 +792,22 @@
     </w:p>
     <w:p>
       <w:pPr>
-        <w:pStyle w:val="ListParagraph"/>
-        <w:numPr>
-          <w:ilvl w:val="0"/>
-          <w:numId w:val="1"/>
-        </w:numPr>
-        <w:rPr>
-          <w:b/>
-          <w:bCs/>
-          <w:sz w:val="40"/>
-          <w:szCs w:val="40"/>
-        </w:rPr>
-      </w:pPr>
-      <w:r>
-        <w:rPr>
-          <w:b/>
-          <w:bCs/>
-          <w:sz w:val="40"/>
-          <w:szCs w:val="40"/>
-        </w:rPr>
+        <w:pStyle w:val="Heading1"/>
+      </w:pPr>
+      <w:bookmarkStart w:id="1" w:name="_Toc241779754"/>
+      <w:r>
         <w:t xml:space="preserve">What </w:t>
       </w:r>
       <w:r>
-        <w:rPr>
-          <w:b/>
-          <w:bCs/>
-          <w:sz w:val="40"/>
-          <w:szCs w:val="40"/>
-        </w:rPr>
         <w:t>is being</w:t>
       </w:r>
       <w:r>
-        <w:rPr>
-          <w:b/>
-          <w:bCs/>
-          <w:sz w:val="40"/>
-          <w:szCs w:val="40"/>
-        </w:rPr>
         <w:t xml:space="preserve"> buil</w:t>
       </w:r>
       <w:r>
-        <w:rPr>
-          <w:b/>
-          <w:bCs/>
-          <w:sz w:val="40"/>
-          <w:szCs w:val="40"/>
-        </w:rPr>
         <w:t>t</w:t>
       </w:r>
+      <w:bookmarkEnd w:id="1"/>
     </w:p>
     <w:p>
       <w:pPr>
@@ -287,7 +857,15 @@
           <w:sz w:val="32"/>
           <w:szCs w:val="32"/>
         </w:rPr>
-        <w:t xml:space="preserve">portfolio managers and financial advisors </w:t>
+        <w:t xml:space="preserve">portfolio managers and </w:t>
+      </w:r>
+      <w:r>
+        <w:rPr>
+          <w:sz w:val="32"/>
+          <w:szCs w:val="32"/>
+        </w:rPr>
+        <w:lastRenderedPageBreak/>
+        <w:t xml:space="preserve">financial advisors </w:t>
       </w:r>
       <w:r>
         <w:rPr>
@@ -460,9 +1038,36 @@
     </w:p>
     <w:p>
       <w:pPr>
+        <w:pStyle w:val="Heading1"/>
+      </w:pPr>
+      <w:bookmarkStart w:id="2" w:name="_Toc241779755"/>
+      <w:r>
+        <w:t>Implementation</w:t>
+      </w:r>
+      <w:bookmarkEnd w:id="2"/>
+    </w:p>
+    <w:p>
+      <w:pPr>
+        <w:pStyle w:val="Heading2"/>
+        <w:rPr>
+          <w:sz w:val="40"/>
+          <w:szCs w:val="40"/>
+        </w:rPr>
+      </w:pPr>
+      <w:bookmarkStart w:id="3" w:name="_Toc241779756"/>
+      <w:r>
+        <w:t>Architecture:</w:t>
+      </w:r>
+      <w:bookmarkEnd w:id="3"/>
+      <w:r>
+        <w:t xml:space="preserve"> </w:t>
+      </w:r>
+    </w:p>
+    <w:p>
+      <w:pPr>
         <w:pStyle w:val="ListParagraph"/>
         <w:numPr>
-          <w:ilvl w:val="0"/>
+          <w:ilvl w:val="2"/>
           <w:numId w:val="1"/>
         </w:numPr>
         <w:rPr>
@@ -474,13 +1079,788 @@
       </w:pPr>
       <w:r>
         <w:rPr>
+          <w:sz w:val="32"/>
+          <w:szCs w:val="32"/>
+        </w:rPr>
+        <w:t xml:space="preserve">Backend -&gt; </w:t>
+      </w:r>
+      <w:proofErr w:type="spellStart"/>
+      <w:r>
+        <w:rPr>
+          <w:sz w:val="32"/>
+          <w:szCs w:val="32"/>
+        </w:rPr>
+        <w:t>FastAPI</w:t>
+      </w:r>
+      <w:proofErr w:type="spellEnd"/>
+      <w:r>
+        <w:rPr>
+          <w:sz w:val="32"/>
+          <w:szCs w:val="32"/>
+        </w:rPr>
+        <w:t xml:space="preserve">: </w:t>
+      </w:r>
+      <w:r>
+        <w:rPr>
+          <w:sz w:val="32"/>
+          <w:szCs w:val="32"/>
+        </w:rPr>
+        <w:t>LLM features, Vector searches, endpoint</w:t>
+      </w:r>
+      <w:r>
+        <w:rPr>
+          <w:sz w:val="32"/>
+          <w:szCs w:val="32"/>
+        </w:rPr>
+        <w:t>s and agents will reside here.</w:t>
+      </w:r>
+    </w:p>
+    <w:p>
+      <w:pPr>
+        <w:pStyle w:val="ListParagraph"/>
+        <w:numPr>
+          <w:ilvl w:val="2"/>
+          <w:numId w:val="1"/>
+        </w:numPr>
+        <w:rPr>
           <w:b/>
           <w:bCs/>
           <w:sz w:val="40"/>
           <w:szCs w:val="40"/>
         </w:rPr>
-        <w:t>Implementation</w:t>
-      </w:r>
+      </w:pPr>
+      <w:r>
+        <w:rPr>
+          <w:sz w:val="32"/>
+          <w:szCs w:val="32"/>
+        </w:rPr>
+        <w:t xml:space="preserve">Frontend -&gt; </w:t>
+      </w:r>
+      <w:proofErr w:type="spellStart"/>
+      <w:r>
+        <w:rPr>
+          <w:sz w:val="32"/>
+          <w:szCs w:val="32"/>
+        </w:rPr>
+        <w:t>Streamlit</w:t>
+      </w:r>
+      <w:proofErr w:type="spellEnd"/>
+      <w:r>
+        <w:rPr>
+          <w:sz w:val="32"/>
+          <w:szCs w:val="32"/>
+        </w:rPr>
+        <w:t>: Accesses backend endpoints through http</w:t>
+      </w:r>
+    </w:p>
+    <w:p>
+      <w:pPr>
+        <w:pStyle w:val="ListParagraph"/>
+        <w:numPr>
+          <w:ilvl w:val="2"/>
+          <w:numId w:val="1"/>
+        </w:numPr>
+        <w:rPr>
+          <w:b/>
+          <w:bCs/>
+          <w:sz w:val="40"/>
+          <w:szCs w:val="40"/>
+        </w:rPr>
+      </w:pPr>
+      <w:r>
+        <w:rPr>
+          <w:sz w:val="32"/>
+          <w:szCs w:val="32"/>
+        </w:rPr>
+        <w:t xml:space="preserve">Database -&gt; </w:t>
+      </w:r>
+      <w:proofErr w:type="spellStart"/>
+      <w:r>
+        <w:rPr>
+          <w:sz w:val="32"/>
+          <w:szCs w:val="32"/>
+        </w:rPr>
+        <w:t>ChromoDB</w:t>
+      </w:r>
+      <w:proofErr w:type="spellEnd"/>
+      <w:r>
+        <w:rPr>
+          <w:sz w:val="32"/>
+          <w:szCs w:val="32"/>
+        </w:rPr>
+        <w:t xml:space="preserve">: Data storage </w:t>
+      </w:r>
+    </w:p>
+    <w:p>
+      <w:pPr>
+        <w:pStyle w:val="Heading2"/>
+        <w:rPr>
+          <w:sz w:val="40"/>
+          <w:szCs w:val="40"/>
+        </w:rPr>
+      </w:pPr>
+      <w:bookmarkStart w:id="4" w:name="_Toc241779757"/>
+      <w:r>
+        <w:t>Design tools</w:t>
+      </w:r>
+      <w:r>
+        <w:t>:</w:t>
+      </w:r>
+      <w:bookmarkEnd w:id="4"/>
+    </w:p>
+    <w:p>
+      <w:pPr>
+        <w:pStyle w:val="ListParagraph"/>
+        <w:numPr>
+          <w:ilvl w:val="2"/>
+          <w:numId w:val="1"/>
+        </w:numPr>
+        <w:rPr>
+          <w:sz w:val="32"/>
+          <w:szCs w:val="32"/>
+        </w:rPr>
+      </w:pPr>
+      <w:r>
+        <w:rPr>
+          <w:sz w:val="32"/>
+          <w:szCs w:val="32"/>
+        </w:rPr>
+        <w:t>Voyage AI: A service that turns text into embeddings.</w:t>
+      </w:r>
+    </w:p>
+    <w:p>
+      <w:pPr>
+        <w:pStyle w:val="ListParagraph"/>
+        <w:numPr>
+          <w:ilvl w:val="2"/>
+          <w:numId w:val="1"/>
+        </w:numPr>
+        <w:rPr>
+          <w:b/>
+          <w:bCs/>
+          <w:sz w:val="40"/>
+          <w:szCs w:val="40"/>
+        </w:rPr>
+      </w:pPr>
+      <w:r>
+        <w:rPr>
+          <w:sz w:val="32"/>
+          <w:szCs w:val="32"/>
+        </w:rPr>
+        <w:t>LLM (ChatGPT, Claude)</w:t>
+      </w:r>
+      <w:r>
+        <w:rPr>
+          <w:sz w:val="32"/>
+          <w:szCs w:val="32"/>
+        </w:rPr>
+        <w:t xml:space="preserve">: An LLM that reads input and writes output according to </w:t>
+      </w:r>
+      <w:r>
+        <w:rPr>
+          <w:sz w:val="32"/>
+          <w:szCs w:val="32"/>
+        </w:rPr>
+        <w:t>the given schema within functions</w:t>
+      </w:r>
+      <w:r>
+        <w:rPr>
+          <w:sz w:val="32"/>
+          <w:szCs w:val="32"/>
+        </w:rPr>
+        <w:t>.</w:t>
+      </w:r>
+    </w:p>
+    <w:p>
+      <w:pPr>
+        <w:pStyle w:val="ListParagraph"/>
+        <w:numPr>
+          <w:ilvl w:val="2"/>
+          <w:numId w:val="1"/>
+        </w:numPr>
+        <w:rPr>
+          <w:b/>
+          <w:bCs/>
+          <w:sz w:val="40"/>
+          <w:szCs w:val="40"/>
+        </w:rPr>
+      </w:pPr>
+      <w:r>
+        <w:rPr>
+          <w:sz w:val="32"/>
+          <w:szCs w:val="32"/>
+        </w:rPr>
+        <w:lastRenderedPageBreak/>
+        <w:t>RAG</w:t>
+      </w:r>
+      <w:r>
+        <w:rPr>
+          <w:sz w:val="32"/>
+          <w:szCs w:val="32"/>
+        </w:rPr>
+        <w:t xml:space="preserve"> system</w:t>
+      </w:r>
+      <w:r>
+        <w:rPr>
+          <w:sz w:val="32"/>
+          <w:szCs w:val="32"/>
+        </w:rPr>
+        <w:t>:</w:t>
+      </w:r>
+      <w:r>
+        <w:rPr>
+          <w:sz w:val="32"/>
+          <w:szCs w:val="32"/>
+        </w:rPr>
+        <w:t xml:space="preserve"> Retr</w:t>
+      </w:r>
+      <w:r>
+        <w:rPr>
+          <w:sz w:val="32"/>
+          <w:szCs w:val="32"/>
+        </w:rPr>
+        <w:t xml:space="preserve">ieve relevant documents, Augment </w:t>
+      </w:r>
+      <w:r>
+        <w:rPr>
+          <w:sz w:val="32"/>
+          <w:szCs w:val="32"/>
+        </w:rPr>
+        <w:t>vectors to and from text</w:t>
+      </w:r>
+      <w:r>
+        <w:rPr>
+          <w:sz w:val="32"/>
+          <w:szCs w:val="32"/>
+        </w:rPr>
+        <w:t xml:space="preserve">, then </w:t>
+      </w:r>
+      <w:r>
+        <w:rPr>
+          <w:sz w:val="32"/>
+          <w:szCs w:val="32"/>
+        </w:rPr>
+        <w:t>give outputs to LLM models to answer from.</w:t>
+      </w:r>
+    </w:p>
+    <w:p>
+      <w:pPr>
+        <w:pStyle w:val="ListParagraph"/>
+        <w:numPr>
+          <w:ilvl w:val="2"/>
+          <w:numId w:val="1"/>
+        </w:numPr>
+        <w:rPr>
+          <w:b/>
+          <w:bCs/>
+          <w:sz w:val="40"/>
+          <w:szCs w:val="40"/>
+        </w:rPr>
+      </w:pPr>
+      <w:r>
+        <w:rPr>
+          <w:sz w:val="32"/>
+          <w:szCs w:val="32"/>
+        </w:rPr>
+        <w:t>Fast API</w:t>
+      </w:r>
+      <w:r>
+        <w:rPr>
+          <w:sz w:val="32"/>
+          <w:szCs w:val="32"/>
+        </w:rPr>
+        <w:t xml:space="preserve">: </w:t>
+      </w:r>
+      <w:r>
+        <w:rPr>
+          <w:sz w:val="32"/>
+          <w:szCs w:val="32"/>
+        </w:rPr>
+        <w:t xml:space="preserve">A </w:t>
+      </w:r>
+      <w:r>
+        <w:rPr>
+          <w:sz w:val="32"/>
+          <w:szCs w:val="32"/>
+        </w:rPr>
+        <w:t>python</w:t>
+      </w:r>
+      <w:r>
+        <w:rPr>
+          <w:sz w:val="32"/>
+          <w:szCs w:val="32"/>
+        </w:rPr>
+        <w:t xml:space="preserve"> web framework useful for </w:t>
+      </w:r>
+      <w:r>
+        <w:rPr>
+          <w:sz w:val="32"/>
+          <w:szCs w:val="32"/>
+        </w:rPr>
+        <w:t>API creation in asynchronous environments</w:t>
+      </w:r>
+      <w:r>
+        <w:rPr>
+          <w:sz w:val="32"/>
+          <w:szCs w:val="32"/>
+        </w:rPr>
+        <w:t>.</w:t>
+      </w:r>
+    </w:p>
+    <w:p>
+      <w:pPr>
+        <w:pStyle w:val="ListParagraph"/>
+        <w:numPr>
+          <w:ilvl w:val="2"/>
+          <w:numId w:val="1"/>
+        </w:numPr>
+        <w:rPr>
+          <w:b/>
+          <w:bCs/>
+          <w:sz w:val="40"/>
+          <w:szCs w:val="40"/>
+        </w:rPr>
+      </w:pPr>
+      <w:proofErr w:type="spellStart"/>
+      <w:r>
+        <w:rPr>
+          <w:sz w:val="32"/>
+          <w:szCs w:val="32"/>
+        </w:rPr>
+        <w:t>Streamlit</w:t>
+      </w:r>
+      <w:proofErr w:type="spellEnd"/>
+      <w:r>
+        <w:rPr>
+          <w:sz w:val="32"/>
+          <w:szCs w:val="32"/>
+        </w:rPr>
+        <w:t xml:space="preserve">: A python library for building </w:t>
+      </w:r>
+      <w:r>
+        <w:rPr>
+          <w:sz w:val="32"/>
+          <w:szCs w:val="32"/>
+        </w:rPr>
+        <w:t>frontend UI</w:t>
+      </w:r>
+    </w:p>
+    <w:p>
+      <w:pPr>
+        <w:pStyle w:val="ListParagraph"/>
+        <w:numPr>
+          <w:ilvl w:val="2"/>
+          <w:numId w:val="1"/>
+        </w:numPr>
+        <w:rPr>
+          <w:b/>
+          <w:bCs/>
+          <w:sz w:val="40"/>
+          <w:szCs w:val="40"/>
+        </w:rPr>
+      </w:pPr>
+      <w:proofErr w:type="spellStart"/>
+      <w:r>
+        <w:rPr>
+          <w:sz w:val="32"/>
+          <w:szCs w:val="32"/>
+        </w:rPr>
+        <w:t>P</w:t>
+      </w:r>
+      <w:r>
+        <w:rPr>
+          <w:sz w:val="32"/>
+          <w:szCs w:val="32"/>
+        </w:rPr>
+        <w:t>ytest</w:t>
+      </w:r>
+      <w:proofErr w:type="spellEnd"/>
+      <w:r>
+        <w:rPr>
+          <w:sz w:val="32"/>
+          <w:szCs w:val="32"/>
+        </w:rPr>
+        <w:t xml:space="preserve">: </w:t>
+      </w:r>
+      <w:r>
+        <w:rPr>
+          <w:sz w:val="32"/>
+          <w:szCs w:val="32"/>
+        </w:rPr>
+        <w:t xml:space="preserve"> </w:t>
+      </w:r>
+      <w:r>
+        <w:rPr>
+          <w:sz w:val="32"/>
+          <w:szCs w:val="32"/>
+        </w:rPr>
+        <w:t>Used to run tests within the to ensure it runs as expected.</w:t>
+      </w:r>
+    </w:p>
+    <w:p>
+      <w:pPr>
+        <w:pStyle w:val="Heading2"/>
+        <w:rPr>
+          <w:sz w:val="40"/>
+          <w:szCs w:val="40"/>
+        </w:rPr>
+      </w:pPr>
+      <w:bookmarkStart w:id="5" w:name="_Toc241779758"/>
+      <w:r>
+        <w:t>Data:</w:t>
+      </w:r>
+      <w:bookmarkEnd w:id="5"/>
+    </w:p>
+    <w:p>
+      <w:pPr>
+        <w:pStyle w:val="ListParagraph"/>
+        <w:numPr>
+          <w:ilvl w:val="2"/>
+          <w:numId w:val="1"/>
+        </w:numPr>
+        <w:rPr>
+          <w:b/>
+          <w:bCs/>
+          <w:sz w:val="40"/>
+          <w:szCs w:val="40"/>
+        </w:rPr>
+      </w:pPr>
+      <w:r>
+        <w:rPr>
+          <w:sz w:val="32"/>
+          <w:szCs w:val="32"/>
+        </w:rPr>
+        <w:t xml:space="preserve">Fund: </w:t>
+      </w:r>
+      <w:r>
+        <w:rPr>
+          <w:sz w:val="32"/>
+          <w:szCs w:val="32"/>
+        </w:rPr>
+        <w:t xml:space="preserve">The fund table will hold information about individual funds such as </w:t>
+      </w:r>
+      <w:r>
+        <w:rPr>
+          <w:sz w:val="32"/>
+          <w:szCs w:val="32"/>
+        </w:rPr>
+        <w:t xml:space="preserve">its name, risk rating, </w:t>
+      </w:r>
+      <w:proofErr w:type="spellStart"/>
+      <w:r>
+        <w:rPr>
+          <w:sz w:val="32"/>
+          <w:szCs w:val="32"/>
+        </w:rPr>
+        <w:t>esg</w:t>
+      </w:r>
+      <w:proofErr w:type="spellEnd"/>
+    </w:p>
+    <w:p>
+      <w:pPr>
+        <w:pStyle w:val="ListParagraph"/>
+        <w:ind w:left="2160"/>
+        <w:rPr>
+          <w:b/>
+          <w:bCs/>
+          <w:sz w:val="40"/>
+          <w:szCs w:val="40"/>
+        </w:rPr>
+      </w:pPr>
+      <w:r>
+        <w:rPr>
+          <w:sz w:val="32"/>
+          <w:szCs w:val="32"/>
+        </w:rPr>
+        <w:t>rating etc.</w:t>
+      </w:r>
+    </w:p>
+    <w:p>
+      <w:pPr>
+        <w:pStyle w:val="ListParagraph"/>
+        <w:numPr>
+          <w:ilvl w:val="2"/>
+          <w:numId w:val="1"/>
+        </w:numPr>
+        <w:rPr>
+          <w:b/>
+          <w:bCs/>
+          <w:sz w:val="40"/>
+          <w:szCs w:val="40"/>
+        </w:rPr>
+      </w:pPr>
+      <w:r>
+        <w:rPr>
+          <w:sz w:val="32"/>
+          <w:szCs w:val="32"/>
+        </w:rPr>
+        <w:t>Clients</w:t>
+      </w:r>
+      <w:r>
+        <w:rPr>
+          <w:sz w:val="32"/>
+          <w:szCs w:val="32"/>
+        </w:rPr>
+        <w:t xml:space="preserve">: The </w:t>
+      </w:r>
+      <w:r>
+        <w:rPr>
+          <w:sz w:val="32"/>
+          <w:szCs w:val="32"/>
+        </w:rPr>
+        <w:t>client</w:t>
+      </w:r>
+      <w:r>
+        <w:rPr>
+          <w:sz w:val="32"/>
+          <w:szCs w:val="32"/>
+        </w:rPr>
+        <w:t xml:space="preserve"> table will hold information on customer </w:t>
+      </w:r>
+      <w:r>
+        <w:rPr>
+          <w:sz w:val="32"/>
+          <w:szCs w:val="32"/>
+        </w:rPr>
+        <w:t xml:space="preserve">mandates such as excluded sectors, </w:t>
+      </w:r>
+      <w:r>
+        <w:rPr>
+          <w:sz w:val="32"/>
+          <w:szCs w:val="32"/>
+        </w:rPr>
+        <w:t xml:space="preserve">minimum </w:t>
+      </w:r>
+      <w:proofErr w:type="spellStart"/>
+      <w:r>
+        <w:rPr>
+          <w:sz w:val="32"/>
+          <w:szCs w:val="32"/>
+        </w:rPr>
+        <w:t>esg</w:t>
+      </w:r>
+      <w:proofErr w:type="spellEnd"/>
+      <w:r>
+        <w:rPr>
+          <w:sz w:val="32"/>
+          <w:szCs w:val="32"/>
+        </w:rPr>
+        <w:t xml:space="preserve"> rating etc.</w:t>
+      </w:r>
+    </w:p>
+    <w:p>
+      <w:pPr>
+        <w:pStyle w:val="ListParagraph"/>
+        <w:numPr>
+          <w:ilvl w:val="2"/>
+          <w:numId w:val="1"/>
+        </w:numPr>
+        <w:rPr>
+          <w:b/>
+          <w:bCs/>
+          <w:sz w:val="40"/>
+          <w:szCs w:val="40"/>
+        </w:rPr>
+      </w:pPr>
+      <w:r>
+        <w:rPr>
+          <w:sz w:val="32"/>
+          <w:szCs w:val="32"/>
+        </w:rPr>
+        <w:t xml:space="preserve">Portfolio: The portfolio table will hold information on </w:t>
+      </w:r>
+      <w:r>
+        <w:rPr>
+          <w:sz w:val="32"/>
+          <w:szCs w:val="32"/>
+        </w:rPr>
+        <w:t>portfolio managers</w:t>
+      </w:r>
+      <w:r>
+        <w:rPr>
+          <w:sz w:val="32"/>
+          <w:szCs w:val="32"/>
+        </w:rPr>
+        <w:t xml:space="preserve"> </w:t>
+      </w:r>
+      <w:r>
+        <w:rPr>
+          <w:sz w:val="32"/>
+          <w:szCs w:val="32"/>
+        </w:rPr>
+        <w:t>id’s</w:t>
+      </w:r>
+      <w:r>
+        <w:rPr>
+          <w:sz w:val="32"/>
+          <w:szCs w:val="32"/>
+        </w:rPr>
+        <w:t>, mandate id’s and positions</w:t>
+      </w:r>
+      <w:r>
+        <w:rPr>
+          <w:sz w:val="32"/>
+          <w:szCs w:val="32"/>
+        </w:rPr>
+        <w:t xml:space="preserve"> (funds involved in portfolio).</w:t>
+      </w:r>
+    </w:p>
+    <w:p>
+      <w:pPr>
+        <w:pStyle w:val="Heading2"/>
+        <w:rPr>
+          <w:sz w:val="40"/>
+          <w:szCs w:val="40"/>
+        </w:rPr>
+      </w:pPr>
+      <w:bookmarkStart w:id="6" w:name="_Toc241779759"/>
+      <w:r>
+        <w:t>Agent tools</w:t>
+      </w:r>
+      <w:r>
+        <w:t>:</w:t>
+      </w:r>
+      <w:bookmarkEnd w:id="6"/>
+    </w:p>
+    <w:p>
+      <w:pPr>
+        <w:pStyle w:val="ListParagraph"/>
+        <w:numPr>
+          <w:ilvl w:val="2"/>
+          <w:numId w:val="1"/>
+        </w:numPr>
+        <w:rPr>
+          <w:b/>
+          <w:bCs/>
+          <w:sz w:val="40"/>
+          <w:szCs w:val="40"/>
+        </w:rPr>
+      </w:pPr>
+      <w:r>
+        <w:rPr>
+          <w:sz w:val="32"/>
+          <w:szCs w:val="32"/>
+        </w:rPr>
+        <w:t xml:space="preserve">Search: </w:t>
+      </w:r>
+      <w:r>
+        <w:rPr>
+          <w:sz w:val="32"/>
+          <w:szCs w:val="32"/>
+        </w:rPr>
+        <w:t xml:space="preserve">Semantic search through the </w:t>
+      </w:r>
+      <w:r>
+        <w:rPr>
+          <w:sz w:val="32"/>
+          <w:szCs w:val="32"/>
+        </w:rPr>
+        <w:t>vectorized</w:t>
+      </w:r>
+      <w:r>
+        <w:rPr>
+          <w:sz w:val="32"/>
+          <w:szCs w:val="32"/>
+        </w:rPr>
+        <w:t xml:space="preserve"> database </w:t>
+      </w:r>
+      <w:r>
+        <w:rPr>
+          <w:sz w:val="32"/>
+          <w:szCs w:val="32"/>
+        </w:rPr>
+        <w:t>for portfolios with least risk for example</w:t>
+      </w:r>
+      <w:r>
+        <w:rPr>
+          <w:sz w:val="32"/>
+          <w:szCs w:val="32"/>
+        </w:rPr>
+        <w:t>.</w:t>
+      </w:r>
+    </w:p>
+    <w:p>
+      <w:pPr>
+        <w:pStyle w:val="ListParagraph"/>
+        <w:numPr>
+          <w:ilvl w:val="2"/>
+          <w:numId w:val="1"/>
+        </w:numPr>
+        <w:rPr>
+          <w:b/>
+          <w:bCs/>
+          <w:sz w:val="40"/>
+          <w:szCs w:val="40"/>
+        </w:rPr>
+      </w:pPr>
+      <w:r>
+        <w:rPr>
+          <w:sz w:val="32"/>
+          <w:szCs w:val="32"/>
+        </w:rPr>
+        <w:t>Summa</w:t>
+      </w:r>
+      <w:r>
+        <w:rPr>
+          <w:sz w:val="32"/>
+          <w:szCs w:val="32"/>
+        </w:rPr>
+        <w:t>rise Portfolio: Read through manag</w:t>
+      </w:r>
+      <w:r>
+        <w:rPr>
+          <w:sz w:val="32"/>
+          <w:szCs w:val="32"/>
+        </w:rPr>
+        <w:t>ement portfolios and summarize what they entail.</w:t>
+      </w:r>
+    </w:p>
+    <w:p>
+      <w:pPr>
+        <w:pStyle w:val="ListParagraph"/>
+        <w:numPr>
+          <w:ilvl w:val="2"/>
+          <w:numId w:val="1"/>
+        </w:numPr>
+        <w:rPr>
+          <w:b/>
+          <w:bCs/>
+          <w:sz w:val="40"/>
+          <w:szCs w:val="40"/>
+        </w:rPr>
+      </w:pPr>
+      <w:r>
+        <w:rPr>
+          <w:sz w:val="32"/>
+          <w:szCs w:val="32"/>
+        </w:rPr>
+        <w:t xml:space="preserve">Summarise Fund: </w:t>
+      </w:r>
+      <w:r>
+        <w:rPr>
+          <w:sz w:val="32"/>
+          <w:szCs w:val="32"/>
+        </w:rPr>
+        <w:t>Read through a fund and summarize what they entail</w:t>
+      </w:r>
+      <w:r>
+        <w:rPr>
+          <w:sz w:val="32"/>
+          <w:szCs w:val="32"/>
+        </w:rPr>
+        <w:t>.</w:t>
+      </w:r>
+    </w:p>
+    <w:p>
+      <w:pPr>
+        <w:pStyle w:val="Heading1"/>
+      </w:pPr>
+      <w:bookmarkStart w:id="7" w:name="_Toc241779760"/>
+      <w:r>
+        <w:lastRenderedPageBreak/>
+        <w:t>Key Words:</w:t>
+      </w:r>
+      <w:bookmarkEnd w:id="7"/>
     </w:p>
     <w:p>
       <w:pPr>
@@ -498,21 +1878,59 @@
       </w:pPr>
       <w:r>
         <w:rPr>
-          <w:b/>
-          <w:bCs/>
-          <w:sz w:val="32"/>
-          <w:szCs w:val="32"/>
-        </w:rPr>
-        <w:t>Architecture:</w:t>
-      </w:r>
-      <w:r>
-        <w:rPr>
-          <w:b/>
-          <w:bCs/>
-          <w:sz w:val="32"/>
-          <w:szCs w:val="32"/>
-        </w:rPr>
-        <w:t xml:space="preserve"> </w:t>
+          <w:sz w:val="32"/>
+          <w:szCs w:val="32"/>
+        </w:rPr>
+        <w:t xml:space="preserve">Environmental Social </w:t>
+      </w:r>
+      <w:r>
+        <w:rPr>
+          <w:sz w:val="32"/>
+          <w:szCs w:val="32"/>
+        </w:rPr>
+        <w:t>Governance</w:t>
+      </w:r>
+      <w:r>
+        <w:rPr>
+          <w:sz w:val="32"/>
+          <w:szCs w:val="32"/>
+        </w:rPr>
+        <w:t>:</w:t>
+      </w:r>
+      <w:r>
+        <w:rPr>
+          <w:sz w:val="32"/>
+          <w:szCs w:val="32"/>
+        </w:rPr>
+        <w:t xml:space="preserve"> ESG refers to </w:t>
+      </w:r>
+      <w:r>
+        <w:rPr>
+          <w:sz w:val="32"/>
+          <w:szCs w:val="32"/>
+        </w:rPr>
+        <w:t xml:space="preserve">a framework </w:t>
+      </w:r>
+      <w:r>
+        <w:rPr>
+          <w:sz w:val="32"/>
+          <w:szCs w:val="32"/>
+        </w:rPr>
+        <w:t xml:space="preserve">fund managers use to evaluate companies </w:t>
+      </w:r>
+      <w:r>
+        <w:rPr>
+          <w:sz w:val="32"/>
+          <w:szCs w:val="32"/>
+        </w:rPr>
+        <w:t>based on non-financial risk</w:t>
+      </w:r>
+      <w:r>
+        <w:rPr>
+          <w:sz w:val="32"/>
+          <w:szCs w:val="32"/>
+        </w:rPr>
+        <w:t>s and long-term sustainability.</w:t>
       </w:r>
     </w:p>
     <w:p>
@@ -534,37 +1952,14 @@
           <w:sz w:val="32"/>
           <w:szCs w:val="32"/>
         </w:rPr>
-        <w:t xml:space="preserve">Backend -&gt; </w:t>
-      </w:r>
-      <w:proofErr w:type="spellStart"/>
-      <w:r>
-        <w:rPr>
-          <w:sz w:val="32"/>
-          <w:szCs w:val="32"/>
-        </w:rPr>
-        <w:t>FastAPI</w:t>
-      </w:r>
-      <w:proofErr w:type="spellEnd"/>
-      <w:r>
-        <w:rPr>
-          <w:sz w:val="32"/>
-          <w:szCs w:val="32"/>
-        </w:rPr>
-        <w:t xml:space="preserve">: </w:t>
-      </w:r>
-      <w:r>
-        <w:rPr>
-          <w:sz w:val="32"/>
-          <w:szCs w:val="32"/>
-        </w:rPr>
-        <w:t>LLM features, Vector searches, endpoint</w:t>
-      </w:r>
-      <w:r>
-        <w:rPr>
-          <w:sz w:val="32"/>
-          <w:szCs w:val="32"/>
-        </w:rPr>
-        <w:t>s and agents will reside here.</w:t>
+        <w:t>Environmental</w:t>
+      </w:r>
+      <w:r>
+        <w:rPr>
+          <w:sz w:val="32"/>
+          <w:szCs w:val="32"/>
+        </w:rPr>
+        <w:t xml:space="preserve"> – How a company impacts and / or protects the natural world.</w:t>
       </w:r>
     </w:p>
     <w:p>
@@ -586,23 +1981,7 @@
           <w:sz w:val="32"/>
           <w:szCs w:val="32"/>
         </w:rPr>
-        <w:t xml:space="preserve">Frontend -&gt; </w:t>
-      </w:r>
-      <w:proofErr w:type="spellStart"/>
-      <w:r>
-        <w:rPr>
-          <w:sz w:val="32"/>
-          <w:szCs w:val="32"/>
-        </w:rPr>
-        <w:t>Streamlit</w:t>
-      </w:r>
-      <w:proofErr w:type="spellEnd"/>
-      <w:r>
-        <w:rPr>
-          <w:sz w:val="32"/>
-          <w:szCs w:val="32"/>
-        </w:rPr>
-        <w:t>: Accesses backend endpoints through http</w:t>
+        <w:t>Social – How a company manages relationships with its workers, customers etc.</w:t>
       </w:r>
     </w:p>
     <w:p>
@@ -624,24 +2003,74 @@
           <w:sz w:val="32"/>
           <w:szCs w:val="32"/>
         </w:rPr>
-        <w:t xml:space="preserve">Database -&gt; </w:t>
-      </w:r>
-      <w:proofErr w:type="spellStart"/>
-      <w:r>
-        <w:rPr>
-          <w:sz w:val="32"/>
-          <w:szCs w:val="32"/>
-        </w:rPr>
-        <w:t>ChromoDB</w:t>
-      </w:r>
-      <w:proofErr w:type="spellEnd"/>
-      <w:r>
-        <w:rPr>
-          <w:sz w:val="32"/>
-          <w:szCs w:val="32"/>
-        </w:rPr>
-        <w:t xml:space="preserve">: Data storage </w:t>
-      </w:r>
+        <w:t xml:space="preserve">Governance – How a </w:t>
+      </w:r>
+      <w:r>
+        <w:rPr>
+          <w:sz w:val="32"/>
+          <w:szCs w:val="32"/>
+        </w:rPr>
+        <w:t>company’s</w:t>
+      </w:r>
+      <w:r>
+        <w:rPr>
+          <w:sz w:val="32"/>
+          <w:szCs w:val="32"/>
+        </w:rPr>
+        <w:t xml:space="preserve"> leadership </w:t>
+      </w:r>
+      <w:r>
+        <w:rPr>
+          <w:sz w:val="32"/>
+          <w:szCs w:val="32"/>
+        </w:rPr>
+        <w:t xml:space="preserve">is handled and </w:t>
+      </w:r>
+      <w:r>
+        <w:rPr>
+          <w:sz w:val="32"/>
+          <w:szCs w:val="32"/>
+        </w:rPr>
+        <w:t xml:space="preserve">conducts business </w:t>
+      </w:r>
+      <w:r>
+        <w:rPr>
+          <w:sz w:val="32"/>
+          <w:szCs w:val="32"/>
+        </w:rPr>
+        <w:t>e.g.</w:t>
+      </w:r>
+      <w:r>
+        <w:rPr>
+          <w:sz w:val="32"/>
+          <w:szCs w:val="32"/>
+        </w:rPr>
+        <w:t xml:space="preserve"> executive compensation, </w:t>
+      </w:r>
+      <w:r>
+        <w:rPr>
+          <w:sz w:val="32"/>
+          <w:szCs w:val="32"/>
+        </w:rPr>
+        <w:t>business ethics etc.</w:t>
+      </w:r>
+      <w:r>
+        <w:rPr>
+          <w:sz w:val="32"/>
+          <w:szCs w:val="32"/>
+        </w:rPr>
+        <w:t xml:space="preserve"> </w:t>
+      </w:r>
+    </w:p>
+    <w:p>
+      <w:pPr>
+        <w:rPr>
+          <w:b/>
+          <w:bCs/>
+          <w:sz w:val="40"/>
+          <w:szCs w:val="40"/>
+        </w:rPr>
+      </w:pPr>
     </w:p>
     <w:p>
       <w:pPr>
@@ -659,50 +2088,35 @@
       </w:pPr>
       <w:r>
         <w:rPr>
-          <w:b/>
-          <w:bCs/>
-          <w:sz w:val="32"/>
-          <w:szCs w:val="32"/>
-        </w:rPr>
-        <w:t>Design tools</w:t>
-      </w:r>
-      <w:r>
-        <w:rPr>
-          <w:b/>
-          <w:bCs/>
-          <w:sz w:val="32"/>
-          <w:szCs w:val="32"/>
-        </w:rPr>
-        <w:t>:</w:t>
-      </w:r>
-    </w:p>
-    <w:p>
-      <w:pPr>
-        <w:pStyle w:val="ListParagraph"/>
-        <w:numPr>
-          <w:ilvl w:val="2"/>
-          <w:numId w:val="1"/>
-        </w:numPr>
-        <w:rPr>
-          <w:sz w:val="32"/>
-          <w:szCs w:val="32"/>
-        </w:rPr>
-      </w:pPr>
-      <w:r>
-        <w:rPr>
-          <w:sz w:val="32"/>
-          <w:szCs w:val="32"/>
-        </w:rPr>
-        <w:t>Voyage AI: A service that turns text into embeddings.</w:t>
-      </w:r>
-    </w:p>
-    <w:p>
-      <w:pPr>
-        <w:pStyle w:val="ListParagraph"/>
-        <w:numPr>
-          <w:ilvl w:val="2"/>
-          <w:numId w:val="1"/>
-        </w:numPr>
+          <w:sz w:val="32"/>
+          <w:szCs w:val="32"/>
+        </w:rPr>
+        <w:t xml:space="preserve">Portfolio Manager: Builds </w:t>
+      </w:r>
+      <w:r>
+        <w:rPr>
+          <w:sz w:val="32"/>
+          <w:szCs w:val="32"/>
+        </w:rPr>
+        <w:t xml:space="preserve">and manages custom investment portfolios </w:t>
+      </w:r>
+      <w:r>
+        <w:rPr>
+          <w:sz w:val="32"/>
+          <w:szCs w:val="32"/>
+        </w:rPr>
+        <w:t xml:space="preserve">accounts for </w:t>
+      </w:r>
+      <w:r>
+        <w:rPr>
+          <w:sz w:val="32"/>
+          <w:szCs w:val="32"/>
+        </w:rPr>
+        <w:t>specific private or institutional clients.</w:t>
+      </w:r>
+    </w:p>
+    <w:p>
+      <w:pPr>
         <w:rPr>
           <w:b/>
           <w:bCs/>
@@ -710,259 +2124,6 @@
           <w:szCs w:val="40"/>
         </w:rPr>
       </w:pPr>
-      <w:r>
-        <w:rPr>
-          <w:sz w:val="32"/>
-          <w:szCs w:val="32"/>
-        </w:rPr>
-        <w:t>LLM (ChatGPT, Claude)</w:t>
-      </w:r>
-      <w:r>
-        <w:rPr>
-          <w:sz w:val="32"/>
-          <w:szCs w:val="32"/>
-        </w:rPr>
-        <w:t xml:space="preserve">: An LLM that reads input and writes output according to </w:t>
-      </w:r>
-      <w:r>
-        <w:rPr>
-          <w:sz w:val="32"/>
-          <w:szCs w:val="32"/>
-        </w:rPr>
-        <w:t>the given schema within functions</w:t>
-      </w:r>
-      <w:r>
-        <w:rPr>
-          <w:sz w:val="32"/>
-          <w:szCs w:val="32"/>
-        </w:rPr>
-        <w:t>.</w:t>
-      </w:r>
-    </w:p>
-    <w:p>
-      <w:pPr>
-        <w:pStyle w:val="ListParagraph"/>
-        <w:numPr>
-          <w:ilvl w:val="2"/>
-          <w:numId w:val="1"/>
-        </w:numPr>
-        <w:rPr>
-          <w:b/>
-          <w:bCs/>
-          <w:sz w:val="40"/>
-          <w:szCs w:val="40"/>
-        </w:rPr>
-      </w:pPr>
-      <w:r>
-        <w:rPr>
-          <w:sz w:val="32"/>
-          <w:szCs w:val="32"/>
-        </w:rPr>
-        <w:t>RAG</w:t>
-      </w:r>
-      <w:r>
-        <w:rPr>
-          <w:sz w:val="32"/>
-          <w:szCs w:val="32"/>
-        </w:rPr>
-        <w:t xml:space="preserve"> system</w:t>
-      </w:r>
-      <w:r>
-        <w:rPr>
-          <w:sz w:val="32"/>
-          <w:szCs w:val="32"/>
-        </w:rPr>
-        <w:t>:</w:t>
-      </w:r>
-      <w:r>
-        <w:rPr>
-          <w:sz w:val="32"/>
-          <w:szCs w:val="32"/>
-        </w:rPr>
-        <w:t xml:space="preserve"> Retr</w:t>
-      </w:r>
-      <w:r>
-        <w:rPr>
-          <w:sz w:val="32"/>
-          <w:szCs w:val="32"/>
-        </w:rPr>
-        <w:t xml:space="preserve">ieve relevant documents, Augment </w:t>
-      </w:r>
-      <w:r>
-        <w:rPr>
-          <w:sz w:val="32"/>
-          <w:szCs w:val="32"/>
-        </w:rPr>
-        <w:t>vectors to and from text</w:t>
-      </w:r>
-      <w:r>
-        <w:rPr>
-          <w:sz w:val="32"/>
-          <w:szCs w:val="32"/>
-        </w:rPr>
-        <w:t xml:space="preserve">, then </w:t>
-      </w:r>
-      <w:r>
-        <w:rPr>
-          <w:sz w:val="32"/>
-          <w:szCs w:val="32"/>
-        </w:rPr>
-        <w:t>give outputs to LLM models to answer from.</w:t>
-      </w:r>
-    </w:p>
-    <w:p>
-      <w:pPr>
-        <w:pStyle w:val="ListParagraph"/>
-        <w:numPr>
-          <w:ilvl w:val="2"/>
-          <w:numId w:val="1"/>
-        </w:numPr>
-        <w:rPr>
-          <w:b/>
-          <w:bCs/>
-          <w:sz w:val="40"/>
-          <w:szCs w:val="40"/>
-        </w:rPr>
-      </w:pPr>
-      <w:r>
-        <w:rPr>
-          <w:sz w:val="32"/>
-          <w:szCs w:val="32"/>
-        </w:rPr>
-        <w:t>Fast API</w:t>
-      </w:r>
-      <w:r>
-        <w:rPr>
-          <w:sz w:val="32"/>
-          <w:szCs w:val="32"/>
-        </w:rPr>
-        <w:t xml:space="preserve">: </w:t>
-      </w:r>
-      <w:r>
-        <w:rPr>
-          <w:sz w:val="32"/>
-          <w:szCs w:val="32"/>
-        </w:rPr>
-        <w:t xml:space="preserve">A </w:t>
-      </w:r>
-      <w:r>
-        <w:rPr>
-          <w:sz w:val="32"/>
-          <w:szCs w:val="32"/>
-        </w:rPr>
-        <w:t>python</w:t>
-      </w:r>
-      <w:r>
-        <w:rPr>
-          <w:sz w:val="32"/>
-          <w:szCs w:val="32"/>
-        </w:rPr>
-        <w:t xml:space="preserve"> web framework useful for </w:t>
-      </w:r>
-      <w:r>
-        <w:rPr>
-          <w:sz w:val="32"/>
-          <w:szCs w:val="32"/>
-        </w:rPr>
-        <w:t>API creation in asynchronous environments</w:t>
-      </w:r>
-      <w:r>
-        <w:rPr>
-          <w:sz w:val="32"/>
-          <w:szCs w:val="32"/>
-        </w:rPr>
-        <w:t>.</w:t>
-      </w:r>
-    </w:p>
-    <w:p>
-      <w:pPr>
-        <w:pStyle w:val="ListParagraph"/>
-        <w:numPr>
-          <w:ilvl w:val="2"/>
-          <w:numId w:val="1"/>
-        </w:numPr>
-        <w:rPr>
-          <w:b/>
-          <w:bCs/>
-          <w:sz w:val="40"/>
-          <w:szCs w:val="40"/>
-        </w:rPr>
-      </w:pPr>
-      <w:proofErr w:type="spellStart"/>
-      <w:r>
-        <w:rPr>
-          <w:sz w:val="32"/>
-          <w:szCs w:val="32"/>
-        </w:rPr>
-        <w:t>Streamlit</w:t>
-      </w:r>
-      <w:proofErr w:type="spellEnd"/>
-      <w:r>
-        <w:rPr>
-          <w:sz w:val="32"/>
-          <w:szCs w:val="32"/>
-        </w:rPr>
-        <w:t xml:space="preserve">: A python library for building </w:t>
-      </w:r>
-      <w:r>
-        <w:rPr>
-          <w:sz w:val="32"/>
-          <w:szCs w:val="32"/>
-        </w:rPr>
-        <w:t>frontend UI</w:t>
-      </w:r>
-    </w:p>
-    <w:p>
-      <w:pPr>
-        <w:pStyle w:val="ListParagraph"/>
-        <w:numPr>
-          <w:ilvl w:val="2"/>
-          <w:numId w:val="1"/>
-        </w:numPr>
-        <w:rPr>
-          <w:b/>
-          <w:bCs/>
-          <w:sz w:val="40"/>
-          <w:szCs w:val="40"/>
-        </w:rPr>
-      </w:pPr>
-      <w:proofErr w:type="spellStart"/>
-      <w:r>
-        <w:rPr>
-          <w:sz w:val="32"/>
-          <w:szCs w:val="32"/>
-        </w:rPr>
-        <w:t>P</w:t>
-      </w:r>
-      <w:r>
-        <w:rPr>
-          <w:sz w:val="32"/>
-          <w:szCs w:val="32"/>
-        </w:rPr>
-        <w:t>ytest</w:t>
-      </w:r>
-      <w:proofErr w:type="spellEnd"/>
-      <w:r>
-        <w:rPr>
-          <w:sz w:val="32"/>
-          <w:szCs w:val="32"/>
-        </w:rPr>
-        <w:t xml:space="preserve">: </w:t>
-      </w:r>
-      <w:r>
-        <w:rPr>
-          <w:sz w:val="32"/>
-          <w:szCs w:val="32"/>
-        </w:rPr>
-        <w:t xml:space="preserve"> </w:t>
-      </w:r>
-      <w:r>
-        <w:rPr>
-          <w:sz w:val="32"/>
-          <w:szCs w:val="32"/>
-        </w:rPr>
-        <w:t>Used to run tests within the to ensure it runs as expected.</w:t>
-      </w:r>
     </w:p>
     <w:p>
       <w:pPr>
@@ -980,21 +2141,78 @@
       </w:pPr>
       <w:r>
         <w:rPr>
-          <w:b/>
-          <w:bCs/>
-          <w:sz w:val="32"/>
-          <w:szCs w:val="32"/>
-        </w:rPr>
-        <w:t>Data:</w:t>
+          <w:sz w:val="32"/>
+          <w:szCs w:val="32"/>
+        </w:rPr>
+        <w:t xml:space="preserve">Fund Manager: </w:t>
+      </w:r>
+      <w:r>
+        <w:rPr>
+          <w:sz w:val="32"/>
+          <w:szCs w:val="32"/>
+        </w:rPr>
+        <w:t>Manages and o</w:t>
+      </w:r>
+      <w:r>
+        <w:rPr>
+          <w:sz w:val="32"/>
+          <w:szCs w:val="32"/>
+        </w:rPr>
+        <w:t>versees</w:t>
+      </w:r>
+      <w:r>
+        <w:rPr>
+          <w:sz w:val="32"/>
+          <w:szCs w:val="32"/>
+        </w:rPr>
+        <w:t xml:space="preserve"> </w:t>
+      </w:r>
+      <w:r>
+        <w:rPr>
+          <w:sz w:val="32"/>
+          <w:szCs w:val="32"/>
+        </w:rPr>
+        <w:t>public investment portfolios</w:t>
+      </w:r>
+      <w:r>
+        <w:rPr>
+          <w:sz w:val="32"/>
+          <w:szCs w:val="32"/>
+        </w:rPr>
+        <w:t xml:space="preserve"> (Pooled </w:t>
+      </w:r>
+      <w:r>
+        <w:rPr>
+          <w:sz w:val="32"/>
+          <w:szCs w:val="32"/>
+        </w:rPr>
+        <w:t>Investment Vehicle)</w:t>
+      </w:r>
+      <w:r>
+        <w:rPr>
+          <w:sz w:val="32"/>
+          <w:szCs w:val="32"/>
+        </w:rPr>
+        <w:t xml:space="preserve"> like mutual funds and ETF’s</w:t>
+      </w:r>
+      <w:r>
+        <w:rPr>
+          <w:sz w:val="32"/>
+          <w:szCs w:val="32"/>
+        </w:rPr>
+        <w:t xml:space="preserve"> shared by </w:t>
+      </w:r>
+      <w:r>
+        <w:rPr>
+          <w:sz w:val="32"/>
+          <w:szCs w:val="32"/>
+        </w:rPr>
+        <w:t>thousands of investors.</w:t>
       </w:r>
     </w:p>
     <w:p>
       <w:pPr>
         <w:pStyle w:val="ListParagraph"/>
-        <w:numPr>
-          <w:ilvl w:val="2"/>
-          <w:numId w:val="1"/>
-        </w:numPr>
         <w:rPr>
           <w:b/>
           <w:bCs/>
@@ -1002,186 +2220,6 @@
           <w:szCs w:val="40"/>
         </w:rPr>
       </w:pPr>
-      <w:r>
-        <w:rPr>
-          <w:sz w:val="32"/>
-          <w:szCs w:val="32"/>
-        </w:rPr>
-        <w:t xml:space="preserve">Fund: </w:t>
-      </w:r>
-      <w:r>
-        <w:rPr>
-          <w:sz w:val="32"/>
-          <w:szCs w:val="32"/>
-        </w:rPr>
-        <w:t xml:space="preserve">The fund table will hold information about individual funds such as </w:t>
-      </w:r>
-      <w:r>
-        <w:rPr>
-          <w:sz w:val="32"/>
-          <w:szCs w:val="32"/>
-        </w:rPr>
-        <w:t xml:space="preserve">its name, risk rating, </w:t>
-      </w:r>
-      <w:proofErr w:type="spellStart"/>
-      <w:r>
-        <w:rPr>
-          <w:sz w:val="32"/>
-          <w:szCs w:val="32"/>
-        </w:rPr>
-        <w:t>esg</w:t>
-      </w:r>
-      <w:proofErr w:type="spellEnd"/>
-    </w:p>
-    <w:p>
-      <w:pPr>
-        <w:pStyle w:val="ListParagraph"/>
-        <w:ind w:left="2160"/>
-        <w:rPr>
-          <w:b/>
-          <w:bCs/>
-          <w:sz w:val="40"/>
-          <w:szCs w:val="40"/>
-        </w:rPr>
-      </w:pPr>
-      <w:r>
-        <w:rPr>
-          <w:sz w:val="32"/>
-          <w:szCs w:val="32"/>
-        </w:rPr>
-        <w:t>rating etc.</w:t>
-      </w:r>
-    </w:p>
-    <w:p>
-      <w:pPr>
-        <w:pStyle w:val="ListParagraph"/>
-        <w:numPr>
-          <w:ilvl w:val="2"/>
-          <w:numId w:val="1"/>
-        </w:numPr>
-        <w:rPr>
-          <w:b/>
-          <w:bCs/>
-          <w:sz w:val="40"/>
-          <w:szCs w:val="40"/>
-        </w:rPr>
-      </w:pPr>
-      <w:r>
-        <w:rPr>
-          <w:sz w:val="32"/>
-          <w:szCs w:val="32"/>
-        </w:rPr>
-        <w:lastRenderedPageBreak/>
-        <w:t>Clients</w:t>
-      </w:r>
-      <w:r>
-        <w:rPr>
-          <w:sz w:val="32"/>
-          <w:szCs w:val="32"/>
-        </w:rPr>
-        <w:t xml:space="preserve">: The </w:t>
-      </w:r>
-      <w:r>
-        <w:rPr>
-          <w:sz w:val="32"/>
-          <w:szCs w:val="32"/>
-        </w:rPr>
-        <w:t>client</w:t>
-      </w:r>
-      <w:r>
-        <w:rPr>
-          <w:sz w:val="32"/>
-          <w:szCs w:val="32"/>
-        </w:rPr>
-        <w:t xml:space="preserve"> table will hold information on customer </w:t>
-      </w:r>
-      <w:r>
-        <w:rPr>
-          <w:sz w:val="32"/>
-          <w:szCs w:val="32"/>
-        </w:rPr>
-        <w:t xml:space="preserve">mandates such as excluded sectors, </w:t>
-      </w:r>
-      <w:r>
-        <w:rPr>
-          <w:sz w:val="32"/>
-          <w:szCs w:val="32"/>
-        </w:rPr>
-        <w:t xml:space="preserve">minimum </w:t>
-      </w:r>
-      <w:proofErr w:type="spellStart"/>
-      <w:r>
-        <w:rPr>
-          <w:sz w:val="32"/>
-          <w:szCs w:val="32"/>
-        </w:rPr>
-        <w:t>esg</w:t>
-      </w:r>
-      <w:proofErr w:type="spellEnd"/>
-      <w:r>
-        <w:rPr>
-          <w:sz w:val="32"/>
-          <w:szCs w:val="32"/>
-        </w:rPr>
-        <w:t xml:space="preserve"> rating etc.</w:t>
-      </w:r>
-    </w:p>
-    <w:p>
-      <w:pPr>
-        <w:pStyle w:val="ListParagraph"/>
-        <w:numPr>
-          <w:ilvl w:val="2"/>
-          <w:numId w:val="1"/>
-        </w:numPr>
-        <w:rPr>
-          <w:b/>
-          <w:bCs/>
-          <w:sz w:val="40"/>
-          <w:szCs w:val="40"/>
-        </w:rPr>
-      </w:pPr>
-      <w:r>
-        <w:rPr>
-          <w:sz w:val="32"/>
-          <w:szCs w:val="32"/>
-        </w:rPr>
-        <w:t xml:space="preserve">Portfolio: The portfolio table will hold information on </w:t>
-      </w:r>
-      <w:r>
-        <w:rPr>
-          <w:sz w:val="32"/>
-          <w:szCs w:val="32"/>
-        </w:rPr>
-        <w:t>portfolio managers</w:t>
-      </w:r>
-      <w:r>
-        <w:rPr>
-          <w:sz w:val="32"/>
-          <w:szCs w:val="32"/>
-        </w:rPr>
-        <w:t xml:space="preserve"> </w:t>
-      </w:r>
-      <w:r>
-        <w:rPr>
-          <w:sz w:val="32"/>
-          <w:szCs w:val="32"/>
-        </w:rPr>
-        <w:t>id’s</w:t>
-      </w:r>
-      <w:r>
-        <w:rPr>
-          <w:sz w:val="32"/>
-          <w:szCs w:val="32"/>
-        </w:rPr>
-        <w:t>, mandate id’s and positions</w:t>
-      </w:r>
-      <w:r>
-        <w:rPr>
-          <w:sz w:val="32"/>
-          <w:szCs w:val="32"/>
-        </w:rPr>
-        <w:t xml:space="preserve"> (funds involved in portfolio).</w:t>
-      </w:r>
     </w:p>
     <w:p>
       <w:pPr>
@@ -1199,563 +2237,25 @@
       </w:pPr>
       <w:r>
         <w:rPr>
-          <w:b/>
-          <w:bCs/>
-          <w:sz w:val="32"/>
-          <w:szCs w:val="32"/>
-        </w:rPr>
-        <w:t>Agent tools</w:t>
-      </w:r>
-      <w:r>
-        <w:rPr>
-          <w:b/>
-          <w:bCs/>
-          <w:sz w:val="32"/>
-          <w:szCs w:val="32"/>
-        </w:rPr>
-        <w:t>:</w:t>
-      </w:r>
-    </w:p>
-    <w:p>
-      <w:pPr>
-        <w:pStyle w:val="ListParagraph"/>
-        <w:numPr>
-          <w:ilvl w:val="2"/>
-          <w:numId w:val="1"/>
-        </w:numPr>
-        <w:rPr>
-          <w:b/>
-          <w:bCs/>
-          <w:sz w:val="40"/>
-          <w:szCs w:val="40"/>
-        </w:rPr>
-      </w:pPr>
-      <w:r>
-        <w:rPr>
-          <w:sz w:val="32"/>
-          <w:szCs w:val="32"/>
-        </w:rPr>
-        <w:t xml:space="preserve">Search: </w:t>
-      </w:r>
-      <w:r>
-        <w:rPr>
-          <w:sz w:val="32"/>
-          <w:szCs w:val="32"/>
-        </w:rPr>
-        <w:t xml:space="preserve">Semantic search through the </w:t>
-      </w:r>
-      <w:r>
-        <w:rPr>
-          <w:sz w:val="32"/>
-          <w:szCs w:val="32"/>
-        </w:rPr>
-        <w:t>vectorized</w:t>
-      </w:r>
-      <w:r>
-        <w:rPr>
-          <w:sz w:val="32"/>
-          <w:szCs w:val="32"/>
-        </w:rPr>
-        <w:t xml:space="preserve"> database </w:t>
-      </w:r>
-      <w:r>
-        <w:rPr>
-          <w:sz w:val="32"/>
-          <w:szCs w:val="32"/>
-        </w:rPr>
-        <w:t>for portfolios with least risk for example</w:t>
-      </w:r>
-      <w:r>
-        <w:rPr>
-          <w:sz w:val="32"/>
-          <w:szCs w:val="32"/>
-        </w:rPr>
-        <w:t>.</w:t>
-      </w:r>
-    </w:p>
-    <w:p>
-      <w:pPr>
-        <w:pStyle w:val="ListParagraph"/>
-        <w:numPr>
-          <w:ilvl w:val="2"/>
-          <w:numId w:val="1"/>
-        </w:numPr>
-        <w:rPr>
-          <w:b/>
-          <w:bCs/>
-          <w:sz w:val="40"/>
-          <w:szCs w:val="40"/>
-        </w:rPr>
-      </w:pPr>
-      <w:r>
-        <w:rPr>
-          <w:sz w:val="32"/>
-          <w:szCs w:val="32"/>
-        </w:rPr>
-        <w:t>Summa</w:t>
-      </w:r>
-      <w:r>
-        <w:rPr>
-          <w:sz w:val="32"/>
-          <w:szCs w:val="32"/>
-        </w:rPr>
-        <w:t>rise Portfolio: Read through manag</w:t>
-      </w:r>
-      <w:r>
-        <w:rPr>
-          <w:sz w:val="32"/>
-          <w:szCs w:val="32"/>
-        </w:rPr>
-        <w:t>ement portfolios and summarize what they entail.</w:t>
-      </w:r>
-    </w:p>
-    <w:p>
-      <w:pPr>
-        <w:pStyle w:val="ListParagraph"/>
-        <w:numPr>
-          <w:ilvl w:val="2"/>
-          <w:numId w:val="1"/>
-        </w:numPr>
-        <w:rPr>
-          <w:b/>
-          <w:bCs/>
-          <w:sz w:val="40"/>
-          <w:szCs w:val="40"/>
-        </w:rPr>
-      </w:pPr>
-      <w:r>
-        <w:rPr>
-          <w:sz w:val="32"/>
-          <w:szCs w:val="32"/>
-        </w:rPr>
-        <w:t xml:space="preserve">Summarise Fund: </w:t>
-      </w:r>
-      <w:r>
-        <w:rPr>
-          <w:sz w:val="32"/>
-          <w:szCs w:val="32"/>
-        </w:rPr>
-        <w:t>Read through a fund and summarize what they entail</w:t>
-      </w:r>
-      <w:r>
-        <w:rPr>
-          <w:sz w:val="32"/>
-          <w:szCs w:val="32"/>
-        </w:rPr>
-        <w:t>.</w:t>
-      </w:r>
-    </w:p>
-    <w:p>
-      <w:pPr>
-        <w:pStyle w:val="ListParagraph"/>
-        <w:numPr>
-          <w:ilvl w:val="0"/>
-          <w:numId w:val="1"/>
-        </w:numPr>
-        <w:rPr>
-          <w:b/>
-          <w:bCs/>
-          <w:sz w:val="40"/>
-          <w:szCs w:val="40"/>
-        </w:rPr>
-      </w:pPr>
-      <w:r>
-        <w:rPr>
-          <w:b/>
-          <w:bCs/>
-          <w:sz w:val="32"/>
-          <w:szCs w:val="32"/>
-        </w:rPr>
-        <w:t>Key Words:</w:t>
-      </w:r>
-    </w:p>
-    <w:p>
-      <w:pPr>
-        <w:pStyle w:val="ListParagraph"/>
-        <w:numPr>
-          <w:ilvl w:val="1"/>
-          <w:numId w:val="1"/>
-        </w:numPr>
-        <w:rPr>
-          <w:b/>
-          <w:bCs/>
-          <w:sz w:val="40"/>
-          <w:szCs w:val="40"/>
-        </w:rPr>
-      </w:pPr>
-      <w:r>
-        <w:rPr>
-          <w:sz w:val="32"/>
-          <w:szCs w:val="32"/>
-        </w:rPr>
-        <w:t xml:space="preserve">Environmental Social </w:t>
-      </w:r>
-      <w:r>
-        <w:rPr>
-          <w:sz w:val="32"/>
-          <w:szCs w:val="32"/>
-        </w:rPr>
-        <w:t>Governance</w:t>
-      </w:r>
-      <w:r>
-        <w:rPr>
-          <w:sz w:val="32"/>
-          <w:szCs w:val="32"/>
-        </w:rPr>
-        <w:t>:</w:t>
-      </w:r>
-      <w:r>
-        <w:rPr>
-          <w:sz w:val="32"/>
-          <w:szCs w:val="32"/>
-        </w:rPr>
-        <w:t xml:space="preserve"> ESG refers to </w:t>
-      </w:r>
-      <w:r>
-        <w:rPr>
-          <w:sz w:val="32"/>
-          <w:szCs w:val="32"/>
-        </w:rPr>
-        <w:t xml:space="preserve">a framework </w:t>
-      </w:r>
-      <w:r>
-        <w:rPr>
-          <w:sz w:val="32"/>
-          <w:szCs w:val="32"/>
-        </w:rPr>
-        <w:t xml:space="preserve">fund managers use to evaluate companies </w:t>
-      </w:r>
-      <w:r>
-        <w:rPr>
-          <w:sz w:val="32"/>
-          <w:szCs w:val="32"/>
-        </w:rPr>
-        <w:t>based on non-financial risk</w:t>
-      </w:r>
-      <w:r>
-        <w:rPr>
-          <w:sz w:val="32"/>
-          <w:szCs w:val="32"/>
-        </w:rPr>
-        <w:t>s and long-term sustainability.</w:t>
-      </w:r>
-    </w:p>
-    <w:p>
-      <w:pPr>
-        <w:pStyle w:val="ListParagraph"/>
-        <w:numPr>
-          <w:ilvl w:val="2"/>
-          <w:numId w:val="1"/>
-        </w:numPr>
-        <w:rPr>
-          <w:b/>
-          <w:bCs/>
-          <w:sz w:val="40"/>
-          <w:szCs w:val="40"/>
-        </w:rPr>
-      </w:pPr>
-      <w:r>
-        <w:rPr>
-          <w:sz w:val="32"/>
-          <w:szCs w:val="32"/>
-        </w:rPr>
-        <w:t>Environmental</w:t>
-      </w:r>
-      <w:r>
-        <w:rPr>
-          <w:sz w:val="32"/>
-          <w:szCs w:val="32"/>
-        </w:rPr>
-        <w:t xml:space="preserve"> – How a company impacts and / or protects the natural world.</w:t>
-      </w:r>
-    </w:p>
-    <w:p>
-      <w:pPr>
-        <w:pStyle w:val="ListParagraph"/>
-        <w:numPr>
-          <w:ilvl w:val="2"/>
-          <w:numId w:val="1"/>
-        </w:numPr>
-        <w:rPr>
-          <w:b/>
-          <w:bCs/>
-          <w:sz w:val="40"/>
-          <w:szCs w:val="40"/>
-        </w:rPr>
-      </w:pPr>
-      <w:r>
-        <w:rPr>
-          <w:sz w:val="32"/>
-          <w:szCs w:val="32"/>
-        </w:rPr>
-        <w:t>Social – How a company manages relationships with its workers, customers etc.</w:t>
-      </w:r>
-    </w:p>
-    <w:p>
-      <w:pPr>
-        <w:pStyle w:val="ListParagraph"/>
-        <w:numPr>
-          <w:ilvl w:val="2"/>
-          <w:numId w:val="1"/>
-        </w:numPr>
-        <w:rPr>
-          <w:b/>
-          <w:bCs/>
-          <w:sz w:val="40"/>
-          <w:szCs w:val="40"/>
-        </w:rPr>
-      </w:pPr>
-      <w:r>
-        <w:rPr>
-          <w:sz w:val="32"/>
-          <w:szCs w:val="32"/>
-        </w:rPr>
-        <w:t xml:space="preserve">Governance – How a </w:t>
-      </w:r>
-      <w:r>
-        <w:rPr>
-          <w:sz w:val="32"/>
-          <w:szCs w:val="32"/>
-        </w:rPr>
-        <w:t>company’s</w:t>
-      </w:r>
-      <w:r>
-        <w:rPr>
-          <w:sz w:val="32"/>
-          <w:szCs w:val="32"/>
-        </w:rPr>
-        <w:t xml:space="preserve"> leadership </w:t>
-      </w:r>
-      <w:r>
-        <w:rPr>
-          <w:sz w:val="32"/>
-          <w:szCs w:val="32"/>
-        </w:rPr>
-        <w:t xml:space="preserve">is handled and </w:t>
-      </w:r>
-      <w:r>
-        <w:rPr>
-          <w:sz w:val="32"/>
-          <w:szCs w:val="32"/>
-        </w:rPr>
-        <w:t xml:space="preserve">conducts business </w:t>
-      </w:r>
-      <w:r>
-        <w:rPr>
-          <w:sz w:val="32"/>
-          <w:szCs w:val="32"/>
-        </w:rPr>
-        <w:t>e.g.</w:t>
-      </w:r>
-      <w:r>
-        <w:rPr>
-          <w:sz w:val="32"/>
-          <w:szCs w:val="32"/>
-        </w:rPr>
-        <w:t xml:space="preserve"> executive compensation, </w:t>
-      </w:r>
-      <w:r>
-        <w:rPr>
-          <w:sz w:val="32"/>
-          <w:szCs w:val="32"/>
-        </w:rPr>
-        <w:t>business ethics etc.</w:t>
-      </w:r>
-      <w:r>
-        <w:rPr>
-          <w:sz w:val="32"/>
-          <w:szCs w:val="32"/>
-        </w:rPr>
-        <w:t xml:space="preserve"> </w:t>
-      </w:r>
-    </w:p>
-    <w:p>
-      <w:pPr>
-        <w:rPr>
-          <w:b/>
-          <w:bCs/>
-          <w:sz w:val="40"/>
-          <w:szCs w:val="40"/>
-        </w:rPr>
-      </w:pPr>
-    </w:p>
-    <w:p>
-      <w:pPr>
-        <w:pStyle w:val="ListParagraph"/>
-        <w:numPr>
-          <w:ilvl w:val="1"/>
-          <w:numId w:val="1"/>
-        </w:numPr>
-        <w:rPr>
-          <w:b/>
-          <w:bCs/>
-          <w:sz w:val="40"/>
-          <w:szCs w:val="40"/>
-        </w:rPr>
-      </w:pPr>
+          <w:sz w:val="32"/>
+          <w:szCs w:val="32"/>
+        </w:rPr>
+        <w:t xml:space="preserve">Pooled Investment vehicle: </w:t>
+      </w:r>
+      <w:r>
+        <w:rPr>
+          <w:sz w:val="32"/>
+          <w:szCs w:val="32"/>
+        </w:rPr>
+        <w:t xml:space="preserve">Think of this as a giant communal bucket. If you only have £100, you cannot buy a meaningful slice of 500 different massive companies. However, if 10,000 people all put £100 into the same bucket, the fund manager now has £1 million </w:t>
+      </w:r>
       <w:r>
         <w:rPr>
           <w:sz w:val="32"/>
           <w:szCs w:val="32"/>
         </w:rPr>
         <w:lastRenderedPageBreak/>
-        <w:t xml:space="preserve">Portfolio Manager: Builds </w:t>
-      </w:r>
-      <w:r>
-        <w:rPr>
-          <w:sz w:val="32"/>
-          <w:szCs w:val="32"/>
-        </w:rPr>
-        <w:t xml:space="preserve">and manages custom investment portfolios </w:t>
-      </w:r>
-      <w:r>
-        <w:rPr>
-          <w:sz w:val="32"/>
-          <w:szCs w:val="32"/>
-        </w:rPr>
-        <w:t xml:space="preserve">accounts for </w:t>
-      </w:r>
-      <w:r>
-        <w:rPr>
-          <w:sz w:val="32"/>
-          <w:szCs w:val="32"/>
-        </w:rPr>
-        <w:t>specific private or institutional clients.</w:t>
-      </w:r>
-    </w:p>
-    <w:p>
-      <w:pPr>
-        <w:rPr>
-          <w:b/>
-          <w:bCs/>
-          <w:sz w:val="40"/>
-          <w:szCs w:val="40"/>
-        </w:rPr>
-      </w:pPr>
-    </w:p>
-    <w:p>
-      <w:pPr>
-        <w:pStyle w:val="ListParagraph"/>
-        <w:numPr>
-          <w:ilvl w:val="1"/>
-          <w:numId w:val="1"/>
-        </w:numPr>
-        <w:rPr>
-          <w:b/>
-          <w:bCs/>
-          <w:sz w:val="40"/>
-          <w:szCs w:val="40"/>
-        </w:rPr>
-      </w:pPr>
-      <w:r>
-        <w:rPr>
-          <w:sz w:val="32"/>
-          <w:szCs w:val="32"/>
-        </w:rPr>
-        <w:t xml:space="preserve">Fund Manager: </w:t>
-      </w:r>
-      <w:r>
-        <w:rPr>
-          <w:sz w:val="32"/>
-          <w:szCs w:val="32"/>
-        </w:rPr>
-        <w:t>Manages and o</w:t>
-      </w:r>
-      <w:r>
-        <w:rPr>
-          <w:sz w:val="32"/>
-          <w:szCs w:val="32"/>
-        </w:rPr>
-        <w:t>versees</w:t>
-      </w:r>
-      <w:r>
-        <w:rPr>
-          <w:sz w:val="32"/>
-          <w:szCs w:val="32"/>
-        </w:rPr>
-        <w:t xml:space="preserve"> </w:t>
-      </w:r>
-      <w:r>
-        <w:rPr>
-          <w:sz w:val="32"/>
-          <w:szCs w:val="32"/>
-        </w:rPr>
-        <w:t>public investment portfolios</w:t>
-      </w:r>
-      <w:r>
-        <w:rPr>
-          <w:sz w:val="32"/>
-          <w:szCs w:val="32"/>
-        </w:rPr>
-        <w:t xml:space="preserve"> (Pooled </w:t>
-      </w:r>
-      <w:r>
-        <w:rPr>
-          <w:sz w:val="32"/>
-          <w:szCs w:val="32"/>
-        </w:rPr>
-        <w:t>Investment Vehicle)</w:t>
-      </w:r>
-      <w:r>
-        <w:rPr>
-          <w:sz w:val="32"/>
-          <w:szCs w:val="32"/>
-        </w:rPr>
-        <w:t xml:space="preserve"> like mutual funds and ETF’s</w:t>
-      </w:r>
-      <w:r>
-        <w:rPr>
-          <w:sz w:val="32"/>
-          <w:szCs w:val="32"/>
-        </w:rPr>
-        <w:t xml:space="preserve"> shared by </w:t>
-      </w:r>
-      <w:r>
-        <w:rPr>
-          <w:sz w:val="32"/>
-          <w:szCs w:val="32"/>
-        </w:rPr>
-        <w:t>thousands of investors.</w:t>
-      </w:r>
-    </w:p>
-    <w:p>
-      <w:pPr>
-        <w:pStyle w:val="ListParagraph"/>
-        <w:rPr>
-          <w:b/>
-          <w:bCs/>
-          <w:sz w:val="40"/>
-          <w:szCs w:val="40"/>
-        </w:rPr>
-      </w:pPr>
-    </w:p>
-    <w:p>
-      <w:pPr>
-        <w:pStyle w:val="ListParagraph"/>
-        <w:numPr>
-          <w:ilvl w:val="1"/>
-          <w:numId w:val="1"/>
-        </w:numPr>
-        <w:rPr>
-          <w:b/>
-          <w:bCs/>
-          <w:sz w:val="40"/>
-          <w:szCs w:val="40"/>
-        </w:rPr>
-      </w:pPr>
-      <w:r>
-        <w:rPr>
-          <w:sz w:val="32"/>
-          <w:szCs w:val="32"/>
-        </w:rPr>
-        <w:t xml:space="preserve">Pooled Investment vehicle: </w:t>
-      </w:r>
-      <w:r>
-        <w:rPr>
-          <w:sz w:val="32"/>
-          <w:szCs w:val="32"/>
-        </w:rPr>
-        <w:t>Think of this as a giant communal bucket. If you only have £100, you cannot buy a meaningful slice of 500 different massive companies. However, if 10,000 people all put £100 into the same bucket, the fund manager now has £1 million to buy a highly diversified mix of assets on behalf of everyone.</w:t>
+        <w:t>to buy a highly diversified mix of assets on behalf of everyone.</w:t>
       </w:r>
     </w:p>
     <w:p>
@@ -1879,7 +2379,6 @@
           <w:sz w:val="32"/>
           <w:szCs w:val="32"/>
         </w:rPr>
-        <w:lastRenderedPageBreak/>
         <w:t>Ongoing Charge Percentage:</w:t>
       </w:r>
       <w:r>
@@ -1887,14 +2386,7 @@
           <w:sz w:val="32"/>
           <w:szCs w:val="32"/>
         </w:rPr>
-        <w:t xml:space="preserve"> </w:t>
-      </w:r>
-      <w:r>
-        <w:rPr>
-          <w:sz w:val="32"/>
-          <w:szCs w:val="32"/>
-        </w:rPr>
-        <w:t>The ongoing charge percentage is the annual fee charged by a fund to cover the ongoing costs of managing and operating the fund.</w:t>
+        <w:t xml:space="preserve"> The ongoing charge percentage is the annual fee charged by a fund to cover the ongoing costs of managing and operating the fund.</w:t>
       </w:r>
     </w:p>
     <w:p>
@@ -2529,7 +3021,6 @@
     <w:next w:val="Normal"/>
     <w:link w:val="Heading2Char"/>
     <w:uiPriority w:val="9"/>
-    <w:semiHidden/>
     <w:unhideWhenUsed/>
     <w:qFormat/>
     <w:rsid w:val="00512688"/>
@@ -2704,6 +3195,7 @@
   <w:style w:type="character" w:default="1" w:styleId="DefaultParagraphFont">
     <w:name w:val="Default Paragraph Font"/>
     <w:uiPriority w:val="1"/>
+    <w:semiHidden/>
     <w:unhideWhenUsed/>
   </w:style>
   <w:style w:type="table" w:default="1" w:styleId="TableNormal">
@@ -2745,7 +3237,6 @@
     <w:basedOn w:val="DefaultParagraphFont"/>
     <w:link w:val="Heading2"/>
     <w:uiPriority w:val="9"/>
-    <w:semiHidden/>
     <w:rsid w:val="00512688"/>
     <w:rPr>
       <w:rFonts w:asciiTheme="majorHAnsi" w:eastAsiaTheme="majorEastAsia" w:hAnsiTheme="majorHAnsi" w:cstheme="majorBidi"/>
@@ -3015,6 +3506,62 @@
       <w:smallCaps/>
       <w:color w:val="0F4761" w:themeColor="accent1" w:themeShade="BF"/>
       <w:spacing w:val="5"/>
+    </w:rPr>
+  </w:style>
+  <w:style w:type="paragraph" w:styleId="TOCHeading">
+    <w:name w:val="TOC Heading"/>
+    <w:basedOn w:val="Heading1"/>
+    <w:next w:val="Normal"/>
+    <w:uiPriority w:val="39"/>
+    <w:unhideWhenUsed/>
+    <w:qFormat/>
+    <w:rsid w:val="00E258F8"/>
+    <w:pPr>
+      <w:spacing w:before="240" w:after="0" w:line="259" w:lineRule="auto"/>
+      <w:outlineLvl w:val="9"/>
+    </w:pPr>
+    <w:rPr>
+      <w:kern w:val="0"/>
+      <w:sz w:val="32"/>
+      <w:szCs w:val="32"/>
+      <w:lang w:val="en-US"/>
+      <w14:ligatures w14:val="none"/>
+    </w:rPr>
+  </w:style>
+  <w:style w:type="paragraph" w:styleId="TOC1">
+    <w:name w:val="toc 1"/>
+    <w:basedOn w:val="Normal"/>
+    <w:next w:val="Normal"/>
+    <w:autoRedefine/>
+    <w:uiPriority w:val="39"/>
+    <w:unhideWhenUsed/>
+    <w:rsid w:val="0057796D"/>
+    <w:pPr>
+      <w:spacing w:after="100"/>
+    </w:pPr>
+  </w:style>
+  <w:style w:type="paragraph" w:styleId="TOC2">
+    <w:name w:val="toc 2"/>
+    <w:basedOn w:val="Normal"/>
+    <w:next w:val="Normal"/>
+    <w:autoRedefine/>
+    <w:uiPriority w:val="39"/>
+    <w:unhideWhenUsed/>
+    <w:rsid w:val="0057796D"/>
+    <w:pPr>
+      <w:spacing w:after="100"/>
+      <w:ind w:left="240"/>
+    </w:pPr>
+  </w:style>
+  <w:style w:type="character" w:styleId="Hyperlink">
+    <w:name w:val="Hyperlink"/>
+    <w:basedOn w:val="DefaultParagraphFont"/>
+    <w:uiPriority w:val="99"/>
+    <w:unhideWhenUsed/>
+    <w:rsid w:val="0057796D"/>
+    <w:rPr>
+      <w:color w:val="467886" w:themeColor="hyperlink"/>
+      <w:u w:val="single"/>
     </w:rPr>
   </w:style>
 </w:styles>

</xml_diff>